<commit_message>
Update portfolio with Matrixx training program and resume updates
</commit_message>
<xml_diff>
--- a/resume cv/Varadharajan-International trainer.docx
+++ b/resume cv/Varadharajan-International trainer.docx
@@ -184,7 +184,6 @@
           <w:t>https://varadharajan4.github.io/portfolio/</w:t>
         </w:r>
       </w:hyperlink>
-      <w:proofErr w:type="gramStart"/>
       <w:r>
         <w:rPr>
           <w:rStyle w:val="Hyperlink"/>
@@ -204,19 +203,7 @@
           <w:szCs w:val="24"/>
           <w:u w:val="none"/>
         </w:rPr>
-        <w:t>(</w:t>
-      </w:r>
-      <w:proofErr w:type="gramEnd"/>
-      <w:r>
-        <w:rPr>
-          <w:rStyle w:val="Hyperlink"/>
-          <w:rFonts w:asciiTheme="majorHAnsi" w:hAnsiTheme="majorHAnsi" w:cstheme="majorHAnsi"/>
-          <w:color w:val="auto"/>
-          <w:sz w:val="24"/>
-          <w:szCs w:val="24"/>
-          <w:u w:val="none"/>
-        </w:rPr>
-        <w:t xml:space="preserve">need more </w:t>
+        <w:t xml:space="preserve">(need more </w:t>
       </w:r>
       <w:r>
         <w:rPr>
@@ -1629,29 +1616,7 @@
           <w:sz w:val="24"/>
           <w:szCs w:val="24"/>
         </w:rPr>
-        <w:t xml:space="preserve">Foundation for Test Automation using </w:t>
-      </w:r>
-      <w:proofErr w:type="spellStart"/>
-      <w:r>
-        <w:rPr>
-          <w:rFonts w:asciiTheme="majorHAnsi" w:hAnsiTheme="majorHAnsi" w:cstheme="majorHAnsi"/>
-          <w:b/>
-          <w:color w:val="000000"/>
-          <w:sz w:val="24"/>
-          <w:szCs w:val="24"/>
-        </w:rPr>
-        <w:t>Sahi</w:t>
-      </w:r>
-      <w:proofErr w:type="spellEnd"/>
-      <w:r>
-        <w:rPr>
-          <w:rFonts w:asciiTheme="majorHAnsi" w:hAnsiTheme="majorHAnsi" w:cstheme="majorHAnsi"/>
-          <w:b/>
-          <w:color w:val="000000"/>
-          <w:sz w:val="24"/>
-          <w:szCs w:val="24"/>
-        </w:rPr>
-        <w:t xml:space="preserve"> Pro</w:t>
+        <w:t>Foundation for Test Automation using Sahi Pro</w:t>
       </w:r>
     </w:p>
     <w:p>
@@ -1989,7 +1954,6 @@
                 <w:szCs w:val="24"/>
               </w:rPr>
             </w:pPr>
-            <w:proofErr w:type="spellStart"/>
             <w:r>
               <w:rPr>
                 <w:rFonts w:asciiTheme="majorHAnsi" w:hAnsiTheme="majorHAnsi" w:cstheme="majorHAnsi"/>
@@ -1997,17 +1961,7 @@
                 <w:sz w:val="24"/>
                 <w:szCs w:val="24"/>
               </w:rPr>
-              <w:t>Edunet</w:t>
-            </w:r>
-            <w:proofErr w:type="spellEnd"/>
-            <w:r>
-              <w:rPr>
-                <w:rFonts w:asciiTheme="majorHAnsi" w:hAnsiTheme="majorHAnsi" w:cstheme="majorHAnsi"/>
-                <w:b/>
-                <w:sz w:val="24"/>
-                <w:szCs w:val="24"/>
-              </w:rPr>
-              <w:t xml:space="preserve"> Foundation, </w:t>
+              <w:t xml:space="preserve">Edunet Foundation, </w:t>
             </w:r>
           </w:p>
         </w:tc>
@@ -2033,7 +1987,6 @@
                 <w:szCs w:val="24"/>
               </w:rPr>
             </w:pPr>
-            <w:proofErr w:type="gramStart"/>
             <w:r>
               <w:rPr>
                 <w:rFonts w:asciiTheme="majorHAnsi" w:hAnsiTheme="majorHAnsi" w:cstheme="majorHAnsi"/>
@@ -2042,18 +1995,7 @@
                 <w:sz w:val="24"/>
                 <w:szCs w:val="24"/>
               </w:rPr>
-              <w:t>Cloud(</w:t>
-            </w:r>
-            <w:proofErr w:type="gramEnd"/>
-            <w:r>
-              <w:rPr>
-                <w:rFonts w:asciiTheme="majorHAnsi" w:hAnsiTheme="majorHAnsi" w:cstheme="majorHAnsi"/>
-                <w:bCs/>
-                <w:color w:val="000000"/>
-                <w:sz w:val="24"/>
-                <w:szCs w:val="24"/>
-              </w:rPr>
-              <w:t>Azure, Render &amp; Heroku), Python full stack with AI, AI trainer, MERN full stack, DevOps trainer, DB tools trainer(MySQL, Oracle, MS SQL server, MongoDB and Postgre</w:t>
+              <w:t>Cloud(Azure, Render &amp; Heroku), Python full stack with AI, AI trainer, MERN full stack, DevOps trainer, DB tools trainer(MySQL, Oracle, MS SQL server, MongoDB and Postgre</w:t>
             </w:r>
             <w:r>
               <w:rPr>
@@ -2173,7 +2115,6 @@
                 <w:szCs w:val="24"/>
               </w:rPr>
             </w:pPr>
-            <w:proofErr w:type="spellStart"/>
             <w:r>
               <w:rPr>
                 <w:rFonts w:asciiTheme="majorHAnsi" w:hAnsiTheme="majorHAnsi" w:cstheme="majorHAnsi"/>
@@ -2181,17 +2122,7 @@
                 <w:sz w:val="24"/>
                 <w:szCs w:val="24"/>
               </w:rPr>
-              <w:t>Matrixx</w:t>
-            </w:r>
-            <w:proofErr w:type="spellEnd"/>
-            <w:r>
-              <w:rPr>
-                <w:rFonts w:asciiTheme="majorHAnsi" w:hAnsiTheme="majorHAnsi" w:cstheme="majorHAnsi"/>
-                <w:b/>
-                <w:sz w:val="24"/>
-                <w:szCs w:val="24"/>
-              </w:rPr>
-              <w:t xml:space="preserve"> Operation Program (Job seekers)</w:t>
+              <w:t>Matrixx Operation Program (Job seekers)</w:t>
             </w:r>
           </w:p>
         </w:tc>
@@ -2217,7 +2148,6 @@
                 <w:szCs w:val="24"/>
               </w:rPr>
             </w:pPr>
-            <w:proofErr w:type="spellStart"/>
             <w:r>
               <w:rPr>
                 <w:rFonts w:asciiTheme="majorHAnsi" w:hAnsiTheme="majorHAnsi" w:cstheme="majorHAnsi"/>
@@ -2226,18 +2156,7 @@
                 <w:sz w:val="24"/>
                 <w:szCs w:val="24"/>
               </w:rPr>
-              <w:t>Matrixx</w:t>
-            </w:r>
-            <w:proofErr w:type="spellEnd"/>
-            <w:r>
-              <w:rPr>
-                <w:rFonts w:asciiTheme="majorHAnsi" w:hAnsiTheme="majorHAnsi" w:cstheme="majorHAnsi"/>
-                <w:bCs/>
-                <w:color w:val="000000"/>
-                <w:sz w:val="24"/>
-                <w:szCs w:val="24"/>
-              </w:rPr>
-              <w:t xml:space="preserve"> Foundation, Technical basics, </w:t>
+              <w:t xml:space="preserve">Matrixx Foundation, Technical basics, </w:t>
             </w:r>
             <w:r>
               <w:rPr>
@@ -2678,7 +2597,6 @@
                 <w:szCs w:val="24"/>
               </w:rPr>
             </w:pPr>
-            <w:proofErr w:type="spellStart"/>
             <w:r>
               <w:rPr>
                 <w:rFonts w:asciiTheme="majorHAnsi" w:hAnsiTheme="majorHAnsi" w:cstheme="majorHAnsi"/>
@@ -2686,17 +2604,7 @@
                 <w:sz w:val="24"/>
                 <w:szCs w:val="24"/>
               </w:rPr>
-              <w:t>EduBridge</w:t>
-            </w:r>
-            <w:proofErr w:type="spellEnd"/>
-            <w:r>
-              <w:rPr>
-                <w:rFonts w:asciiTheme="majorHAnsi" w:hAnsiTheme="majorHAnsi" w:cstheme="majorHAnsi"/>
-                <w:b/>
-                <w:sz w:val="24"/>
-                <w:szCs w:val="24"/>
-              </w:rPr>
-              <w:t xml:space="preserve"> Learning India Private Limited, Mumbai</w:t>
+              <w:t>EduBridge Learning India Private Limited, Mumbai</w:t>
             </w:r>
           </w:p>
         </w:tc>
@@ -3158,51 +3066,15 @@
           <w:szCs w:val="24"/>
         </w:rPr>
       </w:pPr>
-      <w:proofErr w:type="spellStart"/>
-      <w:r>
-        <w:rPr>
-          <w:rFonts w:asciiTheme="majorHAnsi" w:hAnsiTheme="majorHAnsi" w:cstheme="majorHAnsi"/>
-          <w:b/>
-          <w:color w:val="000000"/>
-          <w:sz w:val="24"/>
-          <w:szCs w:val="24"/>
-        </w:rPr>
-        <w:t>Magendhiran</w:t>
-      </w:r>
-      <w:proofErr w:type="spellEnd"/>
-      <w:r>
-        <w:rPr>
-          <w:rFonts w:asciiTheme="majorHAnsi" w:hAnsiTheme="majorHAnsi" w:cstheme="majorHAnsi"/>
-          <w:b/>
-          <w:color w:val="000000"/>
-          <w:sz w:val="24"/>
-          <w:szCs w:val="24"/>
-        </w:rPr>
-        <w:t xml:space="preserve"> Consultancy Services - (</w:t>
-      </w:r>
-      <w:proofErr w:type="spellStart"/>
-      <w:proofErr w:type="gramStart"/>
-      <w:r>
-        <w:rPr>
-          <w:rFonts w:asciiTheme="majorHAnsi" w:hAnsiTheme="majorHAnsi" w:cstheme="majorHAnsi"/>
-          <w:b/>
-          <w:color w:val="000000"/>
-          <w:sz w:val="24"/>
-          <w:szCs w:val="24"/>
-        </w:rPr>
-        <w:t>Sr.Java</w:t>
-      </w:r>
-      <w:proofErr w:type="spellEnd"/>
-      <w:proofErr w:type="gramEnd"/>
-      <w:r>
-        <w:rPr>
-          <w:rFonts w:asciiTheme="majorHAnsi" w:hAnsiTheme="majorHAnsi" w:cstheme="majorHAnsi"/>
-          <w:b/>
-          <w:color w:val="000000"/>
-          <w:sz w:val="24"/>
-          <w:szCs w:val="24"/>
-        </w:rPr>
-        <w:t xml:space="preserve"> Developer)</w:t>
+      <w:r>
+        <w:rPr>
+          <w:rFonts w:asciiTheme="majorHAnsi" w:hAnsiTheme="majorHAnsi" w:cstheme="majorHAnsi"/>
+          <w:b/>
+          <w:color w:val="000000"/>
+          <w:sz w:val="24"/>
+          <w:szCs w:val="24"/>
+        </w:rPr>
+        <w:t>Magendhiran Consultancy Services - (Sr.Java Developer)</w:t>
       </w:r>
     </w:p>
     <w:p>
@@ -3329,7 +3201,6 @@
         </w:rPr>
         <w:t xml:space="preserve">Implemented </w:t>
       </w:r>
-      <w:proofErr w:type="spellStart"/>
       <w:r>
         <w:rPr>
           <w:rFonts w:asciiTheme="majorHAnsi" w:hAnsiTheme="majorHAnsi" w:cstheme="majorHAnsi"/>
@@ -3338,7 +3209,6 @@
         </w:rPr>
         <w:t>Zipkin</w:t>
       </w:r>
-      <w:proofErr w:type="spellEnd"/>
       <w:r>
         <w:rPr>
           <w:rFonts w:asciiTheme="majorHAnsi" w:hAnsiTheme="majorHAnsi" w:cstheme="majorHAnsi"/>
@@ -3404,7 +3274,6 @@
         </w:rPr>
         <w:t xml:space="preserve">Used Spring config server for </w:t>
       </w:r>
-      <w:proofErr w:type="spellStart"/>
       <w:r>
         <w:rPr>
           <w:rFonts w:asciiTheme="majorHAnsi" w:hAnsiTheme="majorHAnsi" w:cstheme="majorHAnsi"/>
@@ -3413,7 +3282,6 @@
         </w:rPr>
         <w:t>centralised</w:t>
       </w:r>
-      <w:proofErr w:type="spellEnd"/>
       <w:r>
         <w:rPr>
           <w:rFonts w:asciiTheme="majorHAnsi" w:hAnsiTheme="majorHAnsi" w:cstheme="majorHAnsi"/>
@@ -3422,7 +3290,6 @@
         </w:rPr>
         <w:t xml:space="preserve"> configuration and Splunk for </w:t>
       </w:r>
-      <w:proofErr w:type="spellStart"/>
       <w:r>
         <w:rPr>
           <w:rFonts w:asciiTheme="majorHAnsi" w:hAnsiTheme="majorHAnsi" w:cstheme="majorHAnsi"/>
@@ -3431,7 +3298,6 @@
         </w:rPr>
         <w:t>centralised</w:t>
       </w:r>
-      <w:proofErr w:type="spellEnd"/>
       <w:r>
         <w:rPr>
           <w:rFonts w:asciiTheme="majorHAnsi" w:hAnsiTheme="majorHAnsi" w:cstheme="majorHAnsi"/>
@@ -3508,43 +3374,7 @@
           <w:sz w:val="24"/>
           <w:szCs w:val="24"/>
         </w:rPr>
-        <w:t xml:space="preserve"> Java 1.8, Restful web Services (JERSEY, Spring Boot), PCF, </w:t>
-      </w:r>
-      <w:proofErr w:type="spellStart"/>
-      <w:r>
-        <w:rPr>
-          <w:rFonts w:asciiTheme="majorHAnsi" w:hAnsiTheme="majorHAnsi" w:cstheme="majorHAnsi"/>
-          <w:sz w:val="24"/>
-          <w:szCs w:val="24"/>
-        </w:rPr>
-        <w:t>Zipkin</w:t>
-      </w:r>
-      <w:proofErr w:type="spellEnd"/>
-      <w:r>
-        <w:rPr>
-          <w:rFonts w:asciiTheme="majorHAnsi" w:hAnsiTheme="majorHAnsi" w:cstheme="majorHAnsi"/>
-          <w:sz w:val="24"/>
-          <w:szCs w:val="24"/>
-        </w:rPr>
-        <w:t xml:space="preserve">, </w:t>
-      </w:r>
-      <w:proofErr w:type="spellStart"/>
-      <w:r>
-        <w:rPr>
-          <w:rFonts w:asciiTheme="majorHAnsi" w:hAnsiTheme="majorHAnsi" w:cstheme="majorHAnsi"/>
-          <w:sz w:val="24"/>
-          <w:szCs w:val="24"/>
-        </w:rPr>
-        <w:t>Hysterix</w:t>
-      </w:r>
-      <w:proofErr w:type="spellEnd"/>
-      <w:r>
-        <w:rPr>
-          <w:rFonts w:asciiTheme="majorHAnsi" w:hAnsiTheme="majorHAnsi" w:cstheme="majorHAnsi"/>
-          <w:sz w:val="24"/>
-          <w:szCs w:val="24"/>
-        </w:rPr>
-        <w:t>, Spring Config server, Angular JS1.x, HTML, JSON, Log4j, Gradle, Git, Junit, Pivotal Tracker, Tomcat 7, DB2, Jenkins, Kafka</w:t>
+        <w:t> Java 1.8, Restful web Services (JERSEY, Spring Boot), PCF, Zipkin, Hysterix, Spring Config server, Angular JS1.x, HTML, JSON, Log4j, Gradle, Git, Junit, Pivotal Tracker, Tomcat 7, DB2, Jenkins, Kafka</w:t>
       </w:r>
       <w:r>
         <w:rPr>
@@ -3560,18 +3390,8 @@
           <w:sz w:val="24"/>
           <w:szCs w:val="24"/>
         </w:rPr>
-        <w:t xml:space="preserve"> Selenium, Mockito, </w:t>
-      </w:r>
-      <w:proofErr w:type="spellStart"/>
-      <w:r>
-        <w:rPr>
-          <w:rFonts w:asciiTheme="majorHAnsi" w:hAnsiTheme="majorHAnsi" w:cstheme="majorHAnsi"/>
-          <w:sz w:val="24"/>
-          <w:szCs w:val="24"/>
-        </w:rPr>
-        <w:t>JQuery</w:t>
-      </w:r>
-      <w:proofErr w:type="spellEnd"/>
+        <w:t xml:space="preserve"> Selenium, Mockito, JQuery</w:t>
+      </w:r>
     </w:p>
     <w:p>
       <w:pPr>
@@ -3598,27 +3418,15 @@
           <w:szCs w:val="24"/>
         </w:rPr>
       </w:pPr>
-      <w:proofErr w:type="spellStart"/>
-      <w:r>
-        <w:rPr>
-          <w:rFonts w:asciiTheme="majorHAnsi" w:hAnsiTheme="majorHAnsi" w:cstheme="majorHAnsi"/>
-          <w:b/>
-          <w:color w:val="000000"/>
-          <w:sz w:val="24"/>
-          <w:szCs w:val="24"/>
-        </w:rPr>
-        <w:t>Magendhiran</w:t>
-      </w:r>
-      <w:proofErr w:type="spellEnd"/>
-      <w:r>
-        <w:rPr>
-          <w:rFonts w:asciiTheme="majorHAnsi" w:hAnsiTheme="majorHAnsi" w:cstheme="majorHAnsi"/>
-          <w:b/>
-          <w:color w:val="000000"/>
-          <w:sz w:val="24"/>
-          <w:szCs w:val="24"/>
-        </w:rPr>
-        <w:t xml:space="preserve"> Consultancy Services (Java Developer)</w:t>
+      <w:r>
+        <w:rPr>
+          <w:rFonts w:asciiTheme="majorHAnsi" w:hAnsiTheme="majorHAnsi" w:cstheme="majorHAnsi"/>
+          <w:b/>
+          <w:color w:val="000000"/>
+          <w:sz w:val="24"/>
+          <w:szCs w:val="24"/>
+        </w:rPr>
+        <w:t>Magendhiran Consultancy Services (Java Developer)</w:t>
       </w:r>
     </w:p>
     <w:p>
@@ -3650,25 +3458,14 @@
         </w:rPr>
         <w:t xml:space="preserve"> </w:t>
       </w:r>
-      <w:proofErr w:type="spellStart"/>
-      <w:r>
-        <w:rPr>
-          <w:rFonts w:asciiTheme="majorHAnsi" w:hAnsiTheme="majorHAnsi" w:cstheme="majorHAnsi"/>
-          <w:b/>
-          <w:sz w:val="24"/>
-          <w:szCs w:val="24"/>
-        </w:rPr>
-        <w:t>Aimco</w:t>
-      </w:r>
-      <w:proofErr w:type="spellEnd"/>
-      <w:r>
-        <w:rPr>
-          <w:rFonts w:asciiTheme="majorHAnsi" w:hAnsiTheme="majorHAnsi" w:cstheme="majorHAnsi"/>
-          <w:b/>
-          <w:sz w:val="24"/>
-          <w:szCs w:val="24"/>
-        </w:rPr>
-        <w:t>) –</w:t>
+      <w:r>
+        <w:rPr>
+          <w:rFonts w:asciiTheme="majorHAnsi" w:hAnsiTheme="majorHAnsi" w:cstheme="majorHAnsi"/>
+          <w:b/>
+          <w:sz w:val="24"/>
+          <w:szCs w:val="24"/>
+        </w:rPr>
+        <w:t>Aimco) –</w:t>
       </w:r>
       <w:r>
         <w:rPr>
@@ -4041,61 +3838,7 @@
           <w:sz w:val="24"/>
           <w:szCs w:val="24"/>
         </w:rPr>
-        <w:t xml:space="preserve"> Java 1.6, Java EE, </w:t>
-      </w:r>
-      <w:proofErr w:type="spellStart"/>
-      <w:r>
-        <w:rPr>
-          <w:rFonts w:asciiTheme="majorHAnsi" w:hAnsiTheme="majorHAnsi" w:cstheme="majorHAnsi"/>
-          <w:sz w:val="24"/>
-          <w:szCs w:val="24"/>
-        </w:rPr>
-        <w:t>SpringIO</w:t>
-      </w:r>
-      <w:proofErr w:type="spellEnd"/>
-      <w:r>
-        <w:rPr>
-          <w:rFonts w:asciiTheme="majorHAnsi" w:hAnsiTheme="majorHAnsi" w:cstheme="majorHAnsi"/>
-          <w:sz w:val="24"/>
-          <w:szCs w:val="24"/>
-        </w:rPr>
-        <w:t xml:space="preserve">, Spring boot 1.2.3 with </w:t>
-      </w:r>
-      <w:proofErr w:type="spellStart"/>
-      <w:r>
-        <w:rPr>
-          <w:rFonts w:asciiTheme="majorHAnsi" w:hAnsiTheme="majorHAnsi" w:cstheme="majorHAnsi"/>
-          <w:sz w:val="24"/>
-          <w:szCs w:val="24"/>
-        </w:rPr>
-        <w:t>Thymeleaf</w:t>
-      </w:r>
-      <w:proofErr w:type="spellEnd"/>
-      <w:r>
-        <w:rPr>
-          <w:rFonts w:asciiTheme="majorHAnsi" w:hAnsiTheme="majorHAnsi" w:cstheme="majorHAnsi"/>
-          <w:sz w:val="24"/>
-          <w:szCs w:val="24"/>
-        </w:rPr>
-        <w:t xml:space="preserve"> 2.1.4, Spring MVC 4.1.5, Hibernate ORM 4.3.5, Agile/Scrum, MySQL 5.5, HTML5, </w:t>
-      </w:r>
-      <w:proofErr w:type="gramStart"/>
-      <w:r>
-        <w:rPr>
-          <w:rFonts w:asciiTheme="majorHAnsi" w:hAnsiTheme="majorHAnsi" w:cstheme="majorHAnsi"/>
-          <w:sz w:val="24"/>
-          <w:szCs w:val="24"/>
-        </w:rPr>
-        <w:t>jQuery,  Apache</w:t>
-      </w:r>
-      <w:proofErr w:type="gramEnd"/>
-      <w:r>
-        <w:rPr>
-          <w:rFonts w:asciiTheme="majorHAnsi" w:hAnsiTheme="majorHAnsi" w:cstheme="majorHAnsi"/>
-          <w:sz w:val="24"/>
-          <w:szCs w:val="24"/>
-        </w:rPr>
-        <w:t xml:space="preserve"> Tomcat 8.0, Linux, Maven 4.0, SVN 1.7, Log4j2.</w:t>
+        <w:t> Java 1.6, Java EE, SpringIO, Spring boot 1.2.3 with Thymeleaf 2.1.4, Spring MVC 4.1.5, Hibernate ORM 4.3.5, Agile/Scrum, MySQL 5.5, HTML5, jQuery,  Apache Tomcat 8.0, Linux, Maven 4.0, SVN 1.7, Log4j2.</w:t>
       </w:r>
     </w:p>
     <w:p>
@@ -4124,27 +3867,15 @@
           <w:szCs w:val="24"/>
         </w:rPr>
       </w:pPr>
-      <w:proofErr w:type="spellStart"/>
-      <w:r>
-        <w:rPr>
-          <w:rFonts w:asciiTheme="majorHAnsi" w:hAnsiTheme="majorHAnsi" w:cstheme="majorHAnsi"/>
-          <w:b/>
-          <w:color w:val="000000"/>
-          <w:sz w:val="24"/>
-          <w:szCs w:val="24"/>
-        </w:rPr>
-        <w:t>Magendhiran</w:t>
-      </w:r>
-      <w:proofErr w:type="spellEnd"/>
-      <w:r>
-        <w:rPr>
-          <w:rFonts w:asciiTheme="majorHAnsi" w:hAnsiTheme="majorHAnsi" w:cstheme="majorHAnsi"/>
-          <w:b/>
-          <w:color w:val="000000"/>
-          <w:sz w:val="24"/>
-          <w:szCs w:val="24"/>
-        </w:rPr>
-        <w:t xml:space="preserve"> Consultancy Services (Java Developer)</w:t>
+      <w:r>
+        <w:rPr>
+          <w:rFonts w:asciiTheme="majorHAnsi" w:hAnsiTheme="majorHAnsi" w:cstheme="majorHAnsi"/>
+          <w:b/>
+          <w:color w:val="000000"/>
+          <w:sz w:val="24"/>
+          <w:szCs w:val="24"/>
+        </w:rPr>
+        <w:t>Magendhiran Consultancy Services (Java Developer)</w:t>
       </w:r>
     </w:p>
     <w:p>
@@ -4737,27 +4468,15 @@
           <w:szCs w:val="24"/>
         </w:rPr>
       </w:pPr>
-      <w:proofErr w:type="spellStart"/>
-      <w:r>
-        <w:rPr>
-          <w:rFonts w:asciiTheme="majorHAnsi" w:hAnsiTheme="majorHAnsi" w:cstheme="majorHAnsi"/>
-          <w:b/>
-          <w:color w:val="000000"/>
-          <w:sz w:val="24"/>
-          <w:szCs w:val="24"/>
-        </w:rPr>
-        <w:t>Magendhiran</w:t>
-      </w:r>
-      <w:proofErr w:type="spellEnd"/>
-      <w:r>
-        <w:rPr>
-          <w:rFonts w:asciiTheme="majorHAnsi" w:hAnsiTheme="majorHAnsi" w:cstheme="majorHAnsi"/>
-          <w:b/>
-          <w:color w:val="000000"/>
-          <w:sz w:val="24"/>
-          <w:szCs w:val="24"/>
-        </w:rPr>
-        <w:t xml:space="preserve"> Consultancy Services - (Java Developer)</w:t>
+      <w:r>
+        <w:rPr>
+          <w:rFonts w:asciiTheme="majorHAnsi" w:hAnsiTheme="majorHAnsi" w:cstheme="majorHAnsi"/>
+          <w:b/>
+          <w:color w:val="000000"/>
+          <w:sz w:val="24"/>
+          <w:szCs w:val="24"/>
+        </w:rPr>
+        <w:t>Magendhiran Consultancy Services - (Java Developer)</w:t>
       </w:r>
     </w:p>
     <w:p>
@@ -5129,23 +4848,13 @@
         </w:rPr>
         <w:t xml:space="preserve">, </w:t>
       </w:r>
-      <w:proofErr w:type="spellStart"/>
-      <w:r>
-        <w:rPr>
-          <w:rFonts w:asciiTheme="majorHAnsi" w:hAnsiTheme="majorHAnsi" w:cstheme="majorHAnsi"/>
-          <w:sz w:val="24"/>
-          <w:szCs w:val="24"/>
-        </w:rPr>
-        <w:t>etc</w:t>
-      </w:r>
-      <w:proofErr w:type="spellEnd"/>
-      <w:r>
-        <w:rPr>
-          <w:rFonts w:asciiTheme="majorHAnsi" w:hAnsiTheme="majorHAnsi" w:cstheme="majorHAnsi"/>
-          <w:sz w:val="24"/>
-          <w:szCs w:val="24"/>
-        </w:rPr>
-        <w:t xml:space="preserve"> for re-usability.</w:t>
+      <w:r>
+        <w:rPr>
+          <w:rFonts w:asciiTheme="majorHAnsi" w:hAnsiTheme="majorHAnsi" w:cstheme="majorHAnsi"/>
+          <w:sz w:val="24"/>
+          <w:szCs w:val="24"/>
+        </w:rPr>
+        <w:t>etc for re-usability.</w:t>
       </w:r>
     </w:p>
     <w:p>
@@ -5328,27 +5037,15 @@
         </w:rPr>
         <w:t>with </w:t>
       </w:r>
-      <w:proofErr w:type="spellStart"/>
-      <w:r>
-        <w:rPr>
-          <w:rFonts w:asciiTheme="majorHAnsi" w:hAnsiTheme="majorHAnsi" w:cstheme="majorHAnsi"/>
-          <w:b/>
-          <w:color w:val="000000"/>
-          <w:sz w:val="24"/>
-          <w:szCs w:val="24"/>
-        </w:rPr>
-        <w:t>MessageDrivenBeans</w:t>
-      </w:r>
-      <w:proofErr w:type="spellEnd"/>
-      <w:r>
-        <w:rPr>
-          <w:rFonts w:asciiTheme="majorHAnsi" w:hAnsiTheme="majorHAnsi" w:cstheme="majorHAnsi"/>
-          <w:b/>
-          <w:color w:val="000000"/>
-          <w:sz w:val="24"/>
-          <w:szCs w:val="24"/>
-        </w:rPr>
-        <w:t> </w:t>
+      <w:r>
+        <w:rPr>
+          <w:rFonts w:asciiTheme="majorHAnsi" w:hAnsiTheme="majorHAnsi" w:cstheme="majorHAnsi"/>
+          <w:b/>
+          <w:color w:val="000000"/>
+          <w:sz w:val="24"/>
+          <w:szCs w:val="24"/>
+        </w:rPr>
+        <w:t>MessageDrivenBeans </w:t>
       </w:r>
       <w:r>
         <w:rPr>
@@ -5568,8 +5265,6 @@
                 <w:lang w:val="en-IN"/>
               </w:rPr>
             </w:pPr>
-            <w:proofErr w:type="spellStart"/>
-            <w:proofErr w:type="gramStart"/>
             <w:r>
               <w:rPr>
                 <w:rFonts w:asciiTheme="majorHAnsi" w:eastAsia="Times New Roman" w:hAnsiTheme="majorHAnsi" w:cstheme="majorHAnsi"/>
@@ -5603,8 +5298,6 @@
               </w:rPr>
               <w:t>No</w:t>
             </w:r>
-            <w:proofErr w:type="spellEnd"/>
-            <w:proofErr w:type="gramEnd"/>
           </w:p>
         </w:tc>
         <w:tc>
@@ -6556,7 +6249,16 @@
                 <w:szCs w:val="24"/>
                 <w:lang w:val="en-IN"/>
               </w:rPr>
-              <w:t>React + Node.js + MongoDB (MERN)</w:t>
+              <w:t>MERN</w:t>
+            </w:r>
+            <w:r>
+              <w:rPr>
+                <w:rFonts w:asciiTheme="majorHAnsi" w:eastAsia="Times New Roman" w:hAnsiTheme="majorHAnsi" w:cstheme="majorHAnsi"/>
+                <w:sz w:val="24"/>
+                <w:szCs w:val="24"/>
+                <w:lang w:val="en-IN"/>
+              </w:rPr>
+              <w:t xml:space="preserve"> Full Stack</w:t>
             </w:r>
           </w:p>
         </w:tc>
@@ -7894,25 +7596,7 @@
           <w:sz w:val="24"/>
           <w:szCs w:val="24"/>
         </w:rPr>
-        <w:t xml:space="preserve">1- Year Experience in Lecturing (June 2005 to July 2006) in the Department of Information Technology, Lord Venkateshwara Engineering College, </w:t>
-      </w:r>
-      <w:proofErr w:type="spellStart"/>
-      <w:r>
-        <w:rPr>
-          <w:rFonts w:asciiTheme="majorHAnsi" w:hAnsiTheme="majorHAnsi" w:cstheme="majorHAnsi"/>
-          <w:sz w:val="24"/>
-          <w:szCs w:val="24"/>
-        </w:rPr>
-        <w:t>Puliyampakkam</w:t>
-      </w:r>
-      <w:proofErr w:type="spellEnd"/>
-      <w:r>
-        <w:rPr>
-          <w:rFonts w:asciiTheme="majorHAnsi" w:hAnsiTheme="majorHAnsi" w:cstheme="majorHAnsi"/>
-          <w:sz w:val="24"/>
-          <w:szCs w:val="24"/>
-        </w:rPr>
-        <w:t>, Kanchipuram.</w:t>
+        <w:t>1- Year Experience in Lecturing (June 2005 to July 2006) in the Department of Information Technology, Lord Venkateshwara Engineering College, Puliyampakkam, Kanchipuram.</w:t>
       </w:r>
     </w:p>
     <w:p>
@@ -7983,7 +7667,6 @@
         </w:rPr>
         <w:t xml:space="preserve">Solved more </w:t>
       </w:r>
-      <w:proofErr w:type="spellStart"/>
       <w:r>
         <w:rPr>
           <w:rFonts w:asciiTheme="majorHAnsi" w:hAnsiTheme="majorHAnsi" w:cstheme="majorHAnsi"/>
@@ -7995,7 +7678,6 @@
         </w:rPr>
         <w:t>leetcode</w:t>
       </w:r>
-      <w:proofErr w:type="spellEnd"/>
       <w:r>
         <w:rPr>
           <w:rFonts w:asciiTheme="majorHAnsi" w:hAnsiTheme="majorHAnsi" w:cstheme="majorHAnsi"/>
@@ -8013,27 +7695,7 @@
           <w:sz w:val="24"/>
           <w:szCs w:val="24"/>
         </w:rPr>
-        <w:t xml:space="preserve"> (refer </w:t>
-      </w:r>
-      <w:proofErr w:type="spellStart"/>
-      <w:r>
-        <w:rPr>
-          <w:rFonts w:asciiTheme="majorHAnsi" w:hAnsiTheme="majorHAnsi" w:cstheme="majorHAnsi"/>
-          <w:color w:val="000000"/>
-          <w:sz w:val="24"/>
-          <w:szCs w:val="24"/>
-        </w:rPr>
-        <w:t>teacheron</w:t>
-      </w:r>
-      <w:proofErr w:type="spellEnd"/>
-      <w:r>
-        <w:rPr>
-          <w:rFonts w:asciiTheme="majorHAnsi" w:hAnsiTheme="majorHAnsi" w:cstheme="majorHAnsi"/>
-          <w:color w:val="000000"/>
-          <w:sz w:val="24"/>
-          <w:szCs w:val="24"/>
-        </w:rPr>
-        <w:t xml:space="preserve"> client from USA)</w:t>
+        <w:t xml:space="preserve"> (refer teacheron client from USA)</w:t>
       </w:r>
     </w:p>
     <w:p>
@@ -8213,7 +7875,6 @@
           <w:sz w:val="24"/>
           <w:szCs w:val="24"/>
         </w:rPr>
-        <w:lastRenderedPageBreak/>
         <w:t>Tagore Institute of Allied Health Sciences, Chennai (Departments</w:t>
       </w:r>
       <w:r>
@@ -8286,6 +7947,7 @@
           <w:sz w:val="24"/>
           <w:szCs w:val="24"/>
         </w:rPr>
+        <w:lastRenderedPageBreak/>
         <w:t xml:space="preserve">Tagore Dental College, Chennai (Ref: Attached photo </w:t>
       </w:r>
       <w:r>
@@ -8340,27 +8002,7 @@
           <w:sz w:val="24"/>
           <w:szCs w:val="24"/>
         </w:rPr>
-        <w:t>Framed syllabus for autonomous colleges and Universities (</w:t>
-      </w:r>
-      <w:proofErr w:type="spellStart"/>
-      <w:r>
-        <w:rPr>
-          <w:rFonts w:asciiTheme="majorHAnsi" w:hAnsiTheme="majorHAnsi" w:cstheme="majorHAnsi"/>
-          <w:color w:val="000000"/>
-          <w:sz w:val="24"/>
-          <w:szCs w:val="24"/>
-        </w:rPr>
-        <w:t>Saveetha</w:t>
-      </w:r>
-      <w:proofErr w:type="spellEnd"/>
-      <w:r>
-        <w:rPr>
-          <w:rFonts w:asciiTheme="majorHAnsi" w:hAnsiTheme="majorHAnsi" w:cstheme="majorHAnsi"/>
-          <w:color w:val="000000"/>
-          <w:sz w:val="24"/>
-          <w:szCs w:val="24"/>
-        </w:rPr>
-        <w:t xml:space="preserve"> University Chennai, Sona College of Technology S</w:t>
+        <w:t>Framed syllabus for autonomous colleges and Universities (Saveetha University Chennai, Sona College of Technology S</w:t>
       </w:r>
       <w:r>
         <w:rPr>
@@ -8504,9 +8146,8 @@
           <w:sz w:val="24"/>
           <w:szCs w:val="24"/>
         </w:rPr>
-        <w:t xml:space="preserve">, </w:t>
-      </w:r>
-      <w:proofErr w:type="spellStart"/>
+        <w:t xml:space="preserve">, Iyappan. L and P. Kasinatha Pandian, “Assessment on </w:t>
+      </w:r>
       <w:r>
         <w:rPr>
           <w:rFonts w:asciiTheme="majorHAnsi" w:hAnsiTheme="majorHAnsi" w:cstheme="majorHAnsi"/>
@@ -8514,9 +8155,8 @@
           <w:sz w:val="24"/>
           <w:szCs w:val="24"/>
         </w:rPr>
-        <w:t>Iyappan</w:t>
-      </w:r>
-      <w:proofErr w:type="spellEnd"/>
+        <w:t>land-use</w:t>
+      </w:r>
       <w:r>
         <w:rPr>
           <w:rFonts w:asciiTheme="majorHAnsi" w:hAnsiTheme="majorHAnsi" w:cstheme="majorHAnsi"/>
@@ -8524,9 +8164,8 @@
           <w:sz w:val="24"/>
           <w:szCs w:val="24"/>
         </w:rPr>
-        <w:t xml:space="preserve">. L and P. </w:t>
-      </w:r>
-      <w:proofErr w:type="spellStart"/>
+        <w:t xml:space="preserve"> changes in Coimbatore North Taluk using Image Processing and Geospatial techniques”, Published in </w:t>
+      </w:r>
       <w:r>
         <w:rPr>
           <w:rFonts w:asciiTheme="majorHAnsi" w:hAnsiTheme="majorHAnsi" w:cstheme="majorHAnsi"/>
@@ -8534,9 +8173,8 @@
           <w:sz w:val="24"/>
           <w:szCs w:val="24"/>
         </w:rPr>
-        <w:t>Kasinatha</w:t>
-      </w:r>
-      <w:proofErr w:type="spellEnd"/>
+        <w:t xml:space="preserve">the </w:t>
+      </w:r>
       <w:r>
         <w:rPr>
           <w:rFonts w:asciiTheme="majorHAnsi" w:hAnsiTheme="majorHAnsi" w:cstheme="majorHAnsi"/>
@@ -8544,16 +8182,17 @@
           <w:sz w:val="24"/>
           <w:szCs w:val="24"/>
         </w:rPr>
-        <w:t xml:space="preserve"> Pandian, “Assessment on </w:t>
-      </w:r>
-      <w:r>
-        <w:rPr>
-          <w:rFonts w:asciiTheme="majorHAnsi" w:hAnsiTheme="majorHAnsi" w:cstheme="majorHAnsi"/>
+        <w:t xml:space="preserve">journal of </w:t>
+      </w:r>
+      <w:r>
+        <w:rPr>
+          <w:rFonts w:asciiTheme="majorHAnsi" w:hAnsiTheme="majorHAnsi" w:cstheme="majorHAnsi"/>
+          <w:b/>
           <w:color w:val="00000A"/>
           <w:sz w:val="24"/>
           <w:szCs w:val="24"/>
         </w:rPr>
-        <w:t>land-use</w:t>
+        <w:t xml:space="preserve">International Journal of Engineering Research and Applications (IJERA), </w:t>
       </w:r>
       <w:r>
         <w:rPr>
@@ -8562,64 +8201,7 @@
           <w:sz w:val="24"/>
           <w:szCs w:val="24"/>
         </w:rPr>
-        <w:t xml:space="preserve"> changes in Coimbatore North Taluk using Image Processing and Geospatial techniques”, Published in </w:t>
-      </w:r>
-      <w:r>
-        <w:rPr>
-          <w:rFonts w:asciiTheme="majorHAnsi" w:hAnsiTheme="majorHAnsi" w:cstheme="majorHAnsi"/>
-          <w:color w:val="00000A"/>
-          <w:sz w:val="24"/>
-          <w:szCs w:val="24"/>
-        </w:rPr>
-        <w:t xml:space="preserve">the </w:t>
-      </w:r>
-      <w:r>
-        <w:rPr>
-          <w:rFonts w:asciiTheme="majorHAnsi" w:hAnsiTheme="majorHAnsi" w:cstheme="majorHAnsi"/>
-          <w:color w:val="00000A"/>
-          <w:sz w:val="24"/>
-          <w:szCs w:val="24"/>
-        </w:rPr>
-        <w:t xml:space="preserve">journal of </w:t>
-      </w:r>
-      <w:r>
-        <w:rPr>
-          <w:rFonts w:asciiTheme="majorHAnsi" w:hAnsiTheme="majorHAnsi" w:cstheme="majorHAnsi"/>
-          <w:b/>
-          <w:color w:val="00000A"/>
-          <w:sz w:val="24"/>
-          <w:szCs w:val="24"/>
-        </w:rPr>
-        <w:t xml:space="preserve">International Journal of Engineering Research and Applications (IJERA), </w:t>
-      </w:r>
-      <w:r>
-        <w:rPr>
-          <w:rFonts w:asciiTheme="majorHAnsi" w:hAnsiTheme="majorHAnsi" w:cstheme="majorHAnsi"/>
-          <w:color w:val="00000A"/>
-          <w:sz w:val="24"/>
-          <w:szCs w:val="24"/>
-        </w:rPr>
-        <w:t xml:space="preserve">ISSN </w:t>
-      </w:r>
-      <w:proofErr w:type="gramStart"/>
-      <w:r>
-        <w:rPr>
-          <w:rFonts w:asciiTheme="majorHAnsi" w:hAnsiTheme="majorHAnsi" w:cstheme="majorHAnsi"/>
-          <w:color w:val="00000A"/>
-          <w:sz w:val="24"/>
-          <w:szCs w:val="24"/>
-        </w:rPr>
-        <w:t>No. :</w:t>
-      </w:r>
-      <w:proofErr w:type="gramEnd"/>
-      <w:r>
-        <w:rPr>
-          <w:rFonts w:asciiTheme="majorHAnsi" w:hAnsiTheme="majorHAnsi" w:cstheme="majorHAnsi"/>
-          <w:color w:val="00000A"/>
-          <w:sz w:val="24"/>
-          <w:szCs w:val="24"/>
-        </w:rPr>
-        <w:t xml:space="preserve"> 2248-9622,</w:t>
+        <w:t>ISSN No. : 2248-9622,</w:t>
       </w:r>
       <w:r>
         <w:rPr>
@@ -9290,43 +8872,7 @@
           <w:sz w:val="24"/>
           <w:szCs w:val="24"/>
         </w:rPr>
-        <w:t xml:space="preserve"> held at B.S </w:t>
-      </w:r>
-      <w:proofErr w:type="spellStart"/>
-      <w:r>
-        <w:rPr>
-          <w:rFonts w:asciiTheme="majorHAnsi" w:hAnsiTheme="majorHAnsi" w:cstheme="majorHAnsi"/>
-          <w:sz w:val="24"/>
-          <w:szCs w:val="24"/>
-        </w:rPr>
-        <w:t>Abdur</w:t>
-      </w:r>
-      <w:proofErr w:type="spellEnd"/>
-      <w:r>
-        <w:rPr>
-          <w:rFonts w:asciiTheme="majorHAnsi" w:hAnsiTheme="majorHAnsi" w:cstheme="majorHAnsi"/>
-          <w:sz w:val="24"/>
-          <w:szCs w:val="24"/>
-        </w:rPr>
-        <w:t xml:space="preserve"> Rahman Crescent University (formerly known as B.S </w:t>
-      </w:r>
-      <w:proofErr w:type="spellStart"/>
-      <w:r>
-        <w:rPr>
-          <w:rFonts w:asciiTheme="majorHAnsi" w:hAnsiTheme="majorHAnsi" w:cstheme="majorHAnsi"/>
-          <w:sz w:val="24"/>
-          <w:szCs w:val="24"/>
-        </w:rPr>
-        <w:t>Abdur</w:t>
-      </w:r>
-      <w:proofErr w:type="spellEnd"/>
-      <w:r>
-        <w:rPr>
-          <w:rFonts w:asciiTheme="majorHAnsi" w:hAnsiTheme="majorHAnsi" w:cstheme="majorHAnsi"/>
-          <w:sz w:val="24"/>
-          <w:szCs w:val="24"/>
-        </w:rPr>
-        <w:t xml:space="preserve"> Rahman Crescent Engineering College) Chennai on 19</w:t>
+        <w:t xml:space="preserve"> held at B.S Abdur Rahman Crescent University (formerly known as B.S Abdur Rahman Crescent Engineering College) Chennai on 19</w:t>
       </w:r>
       <w:r>
         <w:rPr>
@@ -9432,27 +8978,8 @@
           <w:sz w:val="24"/>
           <w:szCs w:val="24"/>
         </w:rPr>
-        <w:t xml:space="preserve"> </w:t>
-      </w:r>
-      <w:proofErr w:type="spellStart"/>
-      <w:r>
-        <w:rPr>
-          <w:rFonts w:asciiTheme="majorHAnsi" w:hAnsiTheme="majorHAnsi" w:cstheme="majorHAnsi"/>
-          <w:sz w:val="24"/>
-          <w:szCs w:val="24"/>
-        </w:rPr>
-        <w:t>Karpaga</w:t>
-      </w:r>
-      <w:proofErr w:type="spellEnd"/>
-      <w:r>
-        <w:rPr>
-          <w:rFonts w:asciiTheme="majorHAnsi" w:hAnsiTheme="majorHAnsi" w:cstheme="majorHAnsi"/>
-          <w:sz w:val="24"/>
-          <w:szCs w:val="24"/>
-        </w:rPr>
-        <w:t xml:space="preserve"> </w:t>
-      </w:r>
-      <w:proofErr w:type="spellStart"/>
+        <w:t xml:space="preserve"> Karpaga </w:t>
+      </w:r>
       <w:r>
         <w:rPr>
           <w:rFonts w:asciiTheme="majorHAnsi" w:hAnsiTheme="majorHAnsi" w:cstheme="majorHAnsi"/>
@@ -9461,32 +8988,13 @@
         </w:rPr>
         <w:t>Vinayaga</w:t>
       </w:r>
-      <w:proofErr w:type="spellEnd"/>
-      <w:r>
-        <w:rPr>
-          <w:rFonts w:asciiTheme="majorHAnsi" w:hAnsiTheme="majorHAnsi" w:cstheme="majorHAnsi"/>
-          <w:sz w:val="24"/>
-          <w:szCs w:val="24"/>
-        </w:rPr>
-        <w:t xml:space="preserve"> College of Engineering and Technology, </w:t>
-      </w:r>
-      <w:proofErr w:type="spellStart"/>
-      <w:r>
-        <w:rPr>
-          <w:rFonts w:asciiTheme="majorHAnsi" w:hAnsiTheme="majorHAnsi" w:cstheme="majorHAnsi"/>
-          <w:sz w:val="24"/>
-          <w:szCs w:val="24"/>
-        </w:rPr>
-        <w:t>Chengalpat</w:t>
-      </w:r>
-      <w:proofErr w:type="spellEnd"/>
-      <w:r>
-        <w:rPr>
-          <w:rFonts w:asciiTheme="majorHAnsi" w:hAnsiTheme="majorHAnsi" w:cstheme="majorHAnsi"/>
-          <w:sz w:val="24"/>
-          <w:szCs w:val="24"/>
-        </w:rPr>
-        <w:t xml:space="preserve"> on 27</w:t>
+      <w:r>
+        <w:rPr>
+          <w:rFonts w:asciiTheme="majorHAnsi" w:hAnsiTheme="majorHAnsi" w:cstheme="majorHAnsi"/>
+          <w:sz w:val="24"/>
+          <w:szCs w:val="24"/>
+        </w:rPr>
+        <w:t xml:space="preserve"> College of Engineering and Technology, Chengalpat on 27</w:t>
       </w:r>
       <w:r>
         <w:rPr>
@@ -9715,17 +9223,181 @@
           <w:sz w:val="24"/>
           <w:szCs w:val="24"/>
         </w:rPr>
+        <w:t xml:space="preserve">Participated in the </w:t>
+      </w:r>
+      <w:r>
+        <w:rPr>
+          <w:rFonts w:asciiTheme="majorHAnsi" w:hAnsiTheme="majorHAnsi" w:cstheme="majorHAnsi"/>
+          <w:b/>
+          <w:sz w:val="24"/>
+          <w:szCs w:val="24"/>
+        </w:rPr>
+        <w:t>“E-Learning in Education”</w:t>
+      </w:r>
+      <w:r>
+        <w:rPr>
+          <w:rFonts w:asciiTheme="majorHAnsi" w:hAnsiTheme="majorHAnsi" w:cstheme="majorHAnsi"/>
+          <w:sz w:val="24"/>
+          <w:szCs w:val="24"/>
+        </w:rPr>
+        <w:t xml:space="preserve"> </w:t>
+      </w:r>
+      <w:r>
+        <w:rPr>
+          <w:rFonts w:asciiTheme="majorHAnsi" w:hAnsiTheme="majorHAnsi" w:cstheme="majorHAnsi"/>
+          <w:sz w:val="24"/>
+          <w:szCs w:val="24"/>
+        </w:rPr>
+        <w:t>at</w:t>
+      </w:r>
+      <w:r>
+        <w:rPr>
+          <w:rFonts w:asciiTheme="majorHAnsi" w:hAnsiTheme="majorHAnsi" w:cstheme="majorHAnsi"/>
+          <w:sz w:val="24"/>
+          <w:szCs w:val="24"/>
+        </w:rPr>
+        <w:t xml:space="preserve"> </w:t>
+      </w:r>
+      <w:r>
+        <w:rPr>
+          <w:rFonts w:asciiTheme="majorHAnsi" w:hAnsiTheme="majorHAnsi" w:cstheme="majorHAnsi"/>
+          <w:sz w:val="24"/>
+          <w:szCs w:val="24"/>
+        </w:rPr>
+        <w:t xml:space="preserve">the </w:t>
+      </w:r>
+      <w:r>
+        <w:rPr>
+          <w:rFonts w:asciiTheme="majorHAnsi" w:hAnsiTheme="majorHAnsi" w:cstheme="majorHAnsi"/>
+          <w:sz w:val="24"/>
+          <w:szCs w:val="24"/>
+        </w:rPr>
+        <w:t>National Institute of Technical Teachers Training and Research Chennai (</w:t>
+      </w:r>
+      <w:r>
+        <w:rPr>
+          <w:rFonts w:asciiTheme="majorHAnsi" w:hAnsiTheme="majorHAnsi" w:cstheme="majorHAnsi"/>
+          <w:b/>
+          <w:sz w:val="24"/>
+          <w:szCs w:val="24"/>
+        </w:rPr>
+        <w:t>NITTTR</w:t>
+      </w:r>
+      <w:r>
+        <w:rPr>
+          <w:rFonts w:asciiTheme="majorHAnsi" w:hAnsiTheme="majorHAnsi" w:cstheme="majorHAnsi"/>
+          <w:sz w:val="24"/>
+          <w:szCs w:val="24"/>
+        </w:rPr>
+        <w:t>) on 19</w:t>
+      </w:r>
+      <w:r>
+        <w:rPr>
+          <w:rFonts w:asciiTheme="majorHAnsi" w:hAnsiTheme="majorHAnsi" w:cstheme="majorHAnsi"/>
+          <w:sz w:val="24"/>
+          <w:szCs w:val="24"/>
+          <w:vertAlign w:val="superscript"/>
+        </w:rPr>
+        <w:t>th</w:t>
+      </w:r>
+      <w:r>
+        <w:rPr>
+          <w:rFonts w:asciiTheme="majorHAnsi" w:hAnsiTheme="majorHAnsi" w:cstheme="majorHAnsi"/>
+          <w:sz w:val="24"/>
+          <w:szCs w:val="24"/>
+        </w:rPr>
+        <w:t xml:space="preserve"> December 2008.</w:t>
+      </w:r>
+    </w:p>
+    <w:p>
+      <w:pPr>
+        <w:spacing w:after="0" w:line="240" w:lineRule="auto"/>
+        <w:jc w:val="both"/>
+        <w:rPr>
+          <w:rFonts w:asciiTheme="majorHAnsi" w:hAnsiTheme="majorHAnsi" w:cstheme="majorHAnsi"/>
+          <w:b/>
+          <w:sz w:val="24"/>
+          <w:szCs w:val="24"/>
+        </w:rPr>
+      </w:pPr>
+    </w:p>
+    <w:p>
+      <w:pPr>
+        <w:spacing w:after="0" w:line="240" w:lineRule="auto"/>
+        <w:jc w:val="both"/>
+        <w:rPr>
+          <w:rFonts w:asciiTheme="majorHAnsi" w:hAnsiTheme="majorHAnsi" w:cstheme="majorHAnsi"/>
+          <w:b/>
+          <w:sz w:val="24"/>
+          <w:szCs w:val="24"/>
+        </w:rPr>
+      </w:pPr>
+      <w:r>
+        <w:rPr>
+          <w:rFonts w:asciiTheme="majorHAnsi" w:hAnsiTheme="majorHAnsi" w:cstheme="majorHAnsi"/>
+          <w:b/>
+          <w:sz w:val="24"/>
+          <w:szCs w:val="24"/>
+        </w:rPr>
         <w:lastRenderedPageBreak/>
-        <w:t xml:space="preserve">Participated in the </w:t>
-      </w:r>
-      <w:r>
-        <w:rPr>
-          <w:rFonts w:asciiTheme="majorHAnsi" w:hAnsiTheme="majorHAnsi" w:cstheme="majorHAnsi"/>
-          <w:b/>
-          <w:sz w:val="24"/>
-          <w:szCs w:val="24"/>
-        </w:rPr>
-        <w:t>“E-Learning in Education”</w:t>
+        <w:t>Roles and Responsibilities in the Organization (</w:t>
+      </w:r>
+      <w:r>
+        <w:rPr>
+          <w:rFonts w:asciiTheme="majorHAnsi" w:hAnsiTheme="majorHAnsi" w:cstheme="majorHAnsi"/>
+          <w:b/>
+          <w:color w:val="000000"/>
+          <w:sz w:val="24"/>
+          <w:szCs w:val="24"/>
+        </w:rPr>
+        <w:t>Magendhiran Consultancy Services)</w:t>
+      </w:r>
+      <w:r>
+        <w:rPr>
+          <w:rFonts w:asciiTheme="majorHAnsi" w:hAnsiTheme="majorHAnsi" w:cstheme="majorHAnsi"/>
+          <w:b/>
+          <w:sz w:val="24"/>
+          <w:szCs w:val="24"/>
+        </w:rPr>
+        <w:t>:</w:t>
+      </w:r>
+    </w:p>
+    <w:p>
+      <w:pPr>
+        <w:spacing w:after="0" w:line="240" w:lineRule="auto"/>
+        <w:jc w:val="both"/>
+        <w:rPr>
+          <w:rFonts w:asciiTheme="majorHAnsi" w:hAnsiTheme="majorHAnsi" w:cstheme="majorHAnsi"/>
+          <w:b/>
+          <w:color w:val="000000"/>
+          <w:sz w:val="24"/>
+          <w:szCs w:val="24"/>
+        </w:rPr>
+      </w:pPr>
+      <w:r>
+        <w:rPr>
+          <w:rFonts w:asciiTheme="majorHAnsi" w:hAnsiTheme="majorHAnsi" w:cstheme="majorHAnsi"/>
+          <w:b/>
+          <w:sz w:val="24"/>
+          <w:szCs w:val="24"/>
+        </w:rPr>
+        <w:tab/>
+      </w:r>
+      <w:r>
+        <w:rPr>
+          <w:rFonts w:asciiTheme="majorHAnsi" w:hAnsiTheme="majorHAnsi" w:cstheme="majorHAnsi"/>
+          <w:sz w:val="24"/>
+          <w:szCs w:val="24"/>
+        </w:rPr>
+        <w:t>Currently</w:t>
+      </w:r>
+      <w:r>
+        <w:rPr>
+          <w:rFonts w:asciiTheme="majorHAnsi" w:hAnsiTheme="majorHAnsi" w:cstheme="majorHAnsi"/>
+          <w:sz w:val="24"/>
+          <w:szCs w:val="24"/>
+        </w:rPr>
+        <w:t>,</w:t>
       </w:r>
       <w:r>
         <w:rPr>
@@ -9741,182 +9413,6 @@
           <w:sz w:val="24"/>
           <w:szCs w:val="24"/>
         </w:rPr>
-        <w:t>at</w:t>
-      </w:r>
-      <w:r>
-        <w:rPr>
-          <w:rFonts w:asciiTheme="majorHAnsi" w:hAnsiTheme="majorHAnsi" w:cstheme="majorHAnsi"/>
-          <w:sz w:val="24"/>
-          <w:szCs w:val="24"/>
-        </w:rPr>
-        <w:t xml:space="preserve"> </w:t>
-      </w:r>
-      <w:r>
-        <w:rPr>
-          <w:rFonts w:asciiTheme="majorHAnsi" w:hAnsiTheme="majorHAnsi" w:cstheme="majorHAnsi"/>
-          <w:sz w:val="24"/>
-          <w:szCs w:val="24"/>
-        </w:rPr>
-        <w:t xml:space="preserve">the </w:t>
-      </w:r>
-      <w:r>
-        <w:rPr>
-          <w:rFonts w:asciiTheme="majorHAnsi" w:hAnsiTheme="majorHAnsi" w:cstheme="majorHAnsi"/>
-          <w:sz w:val="24"/>
-          <w:szCs w:val="24"/>
-        </w:rPr>
-        <w:t>National Institute of Technical Teachers Training and Research Chennai (</w:t>
-      </w:r>
-      <w:r>
-        <w:rPr>
-          <w:rFonts w:asciiTheme="majorHAnsi" w:hAnsiTheme="majorHAnsi" w:cstheme="majorHAnsi"/>
-          <w:b/>
-          <w:sz w:val="24"/>
-          <w:szCs w:val="24"/>
-        </w:rPr>
-        <w:t>NITTTR</w:t>
-      </w:r>
-      <w:r>
-        <w:rPr>
-          <w:rFonts w:asciiTheme="majorHAnsi" w:hAnsiTheme="majorHAnsi" w:cstheme="majorHAnsi"/>
-          <w:sz w:val="24"/>
-          <w:szCs w:val="24"/>
-        </w:rPr>
-        <w:t>) on 19</w:t>
-      </w:r>
-      <w:r>
-        <w:rPr>
-          <w:rFonts w:asciiTheme="majorHAnsi" w:hAnsiTheme="majorHAnsi" w:cstheme="majorHAnsi"/>
-          <w:sz w:val="24"/>
-          <w:szCs w:val="24"/>
-          <w:vertAlign w:val="superscript"/>
-        </w:rPr>
-        <w:t>th</w:t>
-      </w:r>
-      <w:r>
-        <w:rPr>
-          <w:rFonts w:asciiTheme="majorHAnsi" w:hAnsiTheme="majorHAnsi" w:cstheme="majorHAnsi"/>
-          <w:sz w:val="24"/>
-          <w:szCs w:val="24"/>
-        </w:rPr>
-        <w:t xml:space="preserve"> December 2008.</w:t>
-      </w:r>
-    </w:p>
-    <w:p>
-      <w:pPr>
-        <w:spacing w:after="0" w:line="240" w:lineRule="auto"/>
-        <w:jc w:val="both"/>
-        <w:rPr>
-          <w:rFonts w:asciiTheme="majorHAnsi" w:hAnsiTheme="majorHAnsi" w:cstheme="majorHAnsi"/>
-          <w:b/>
-          <w:sz w:val="24"/>
-          <w:szCs w:val="24"/>
-        </w:rPr>
-      </w:pPr>
-    </w:p>
-    <w:p>
-      <w:pPr>
-        <w:spacing w:after="0" w:line="240" w:lineRule="auto"/>
-        <w:jc w:val="both"/>
-        <w:rPr>
-          <w:rFonts w:asciiTheme="majorHAnsi" w:hAnsiTheme="majorHAnsi" w:cstheme="majorHAnsi"/>
-          <w:b/>
-          <w:sz w:val="24"/>
-          <w:szCs w:val="24"/>
-        </w:rPr>
-      </w:pPr>
-      <w:r>
-        <w:rPr>
-          <w:rFonts w:asciiTheme="majorHAnsi" w:hAnsiTheme="majorHAnsi" w:cstheme="majorHAnsi"/>
-          <w:b/>
-          <w:sz w:val="24"/>
-          <w:szCs w:val="24"/>
-        </w:rPr>
-        <w:t>Roles and Responsibilities in the Organization (</w:t>
-      </w:r>
-      <w:proofErr w:type="spellStart"/>
-      <w:r>
-        <w:rPr>
-          <w:rFonts w:asciiTheme="majorHAnsi" w:hAnsiTheme="majorHAnsi" w:cstheme="majorHAnsi"/>
-          <w:b/>
-          <w:color w:val="000000"/>
-          <w:sz w:val="24"/>
-          <w:szCs w:val="24"/>
-        </w:rPr>
-        <w:t>Magendhiran</w:t>
-      </w:r>
-      <w:proofErr w:type="spellEnd"/>
-      <w:r>
-        <w:rPr>
-          <w:rFonts w:asciiTheme="majorHAnsi" w:hAnsiTheme="majorHAnsi" w:cstheme="majorHAnsi"/>
-          <w:b/>
-          <w:color w:val="000000"/>
-          <w:sz w:val="24"/>
-          <w:szCs w:val="24"/>
-        </w:rPr>
-        <w:t xml:space="preserve"> Consultancy Services)</w:t>
-      </w:r>
-      <w:r>
-        <w:rPr>
-          <w:rFonts w:asciiTheme="majorHAnsi" w:hAnsiTheme="majorHAnsi" w:cstheme="majorHAnsi"/>
-          <w:b/>
-          <w:sz w:val="24"/>
-          <w:szCs w:val="24"/>
-        </w:rPr>
-        <w:t>:</w:t>
-      </w:r>
-    </w:p>
-    <w:p>
-      <w:pPr>
-        <w:spacing w:after="0" w:line="240" w:lineRule="auto"/>
-        <w:jc w:val="both"/>
-        <w:rPr>
-          <w:rFonts w:asciiTheme="majorHAnsi" w:hAnsiTheme="majorHAnsi" w:cstheme="majorHAnsi"/>
-          <w:b/>
-          <w:color w:val="000000"/>
-          <w:sz w:val="24"/>
-          <w:szCs w:val="24"/>
-        </w:rPr>
-      </w:pPr>
-      <w:r>
-        <w:rPr>
-          <w:rFonts w:asciiTheme="majorHAnsi" w:hAnsiTheme="majorHAnsi" w:cstheme="majorHAnsi"/>
-          <w:b/>
-          <w:sz w:val="24"/>
-          <w:szCs w:val="24"/>
-        </w:rPr>
-        <w:tab/>
-      </w:r>
-      <w:r>
-        <w:rPr>
-          <w:rFonts w:asciiTheme="majorHAnsi" w:hAnsiTheme="majorHAnsi" w:cstheme="majorHAnsi"/>
-          <w:sz w:val="24"/>
-          <w:szCs w:val="24"/>
-        </w:rPr>
-        <w:t>Currently</w:t>
-      </w:r>
-      <w:r>
-        <w:rPr>
-          <w:rFonts w:asciiTheme="majorHAnsi" w:hAnsiTheme="majorHAnsi" w:cstheme="majorHAnsi"/>
-          <w:sz w:val="24"/>
-          <w:szCs w:val="24"/>
-        </w:rPr>
-        <w:t>,</w:t>
-      </w:r>
-      <w:r>
-        <w:rPr>
-          <w:rFonts w:asciiTheme="majorHAnsi" w:hAnsiTheme="majorHAnsi" w:cstheme="majorHAnsi"/>
-          <w:sz w:val="24"/>
-          <w:szCs w:val="24"/>
-        </w:rPr>
-        <w:t xml:space="preserve"> </w:t>
-      </w:r>
-      <w:r>
-        <w:rPr>
-          <w:rFonts w:asciiTheme="majorHAnsi" w:hAnsiTheme="majorHAnsi" w:cstheme="majorHAnsi"/>
-          <w:sz w:val="24"/>
-          <w:szCs w:val="24"/>
-        </w:rPr>
         <w:t>part-time</w:t>
       </w:r>
       <w:r>
@@ -9944,27 +9440,15 @@
         </w:rPr>
         <w:t xml:space="preserve"> in the Organization of </w:t>
       </w:r>
-      <w:proofErr w:type="spellStart"/>
-      <w:r>
-        <w:rPr>
-          <w:rFonts w:asciiTheme="majorHAnsi" w:hAnsiTheme="majorHAnsi" w:cstheme="majorHAnsi"/>
-          <w:b/>
-          <w:color w:val="000000"/>
-          <w:sz w:val="24"/>
-          <w:szCs w:val="24"/>
-        </w:rPr>
-        <w:t>Magendhiran</w:t>
-      </w:r>
-      <w:proofErr w:type="spellEnd"/>
-      <w:r>
-        <w:rPr>
-          <w:rFonts w:asciiTheme="majorHAnsi" w:hAnsiTheme="majorHAnsi" w:cstheme="majorHAnsi"/>
-          <w:b/>
-          <w:color w:val="000000"/>
-          <w:sz w:val="24"/>
-          <w:szCs w:val="24"/>
-        </w:rPr>
-        <w:t xml:space="preserve"> Consultancy Services (2011 to till date)</w:t>
+      <w:r>
+        <w:rPr>
+          <w:rFonts w:asciiTheme="majorHAnsi" w:hAnsiTheme="majorHAnsi" w:cstheme="majorHAnsi"/>
+          <w:b/>
+          <w:color w:val="000000"/>
+          <w:sz w:val="24"/>
+          <w:szCs w:val="24"/>
+        </w:rPr>
+        <w:t>Magendhiran Consultancy Services (2011 to till date)</w:t>
       </w:r>
     </w:p>
     <w:p>
@@ -10081,25 +9565,7 @@
           <w:sz w:val="24"/>
           <w:szCs w:val="24"/>
         </w:rPr>
-        <w:t xml:space="preserve">, </w:t>
-      </w:r>
-      <w:proofErr w:type="spellStart"/>
-      <w:r>
-        <w:rPr>
-          <w:rFonts w:asciiTheme="majorHAnsi" w:hAnsiTheme="majorHAnsi" w:cstheme="majorHAnsi"/>
-          <w:sz w:val="24"/>
-          <w:szCs w:val="24"/>
-        </w:rPr>
-        <w:t>Kavarepettai</w:t>
-      </w:r>
-      <w:proofErr w:type="spellEnd"/>
-      <w:r>
-        <w:rPr>
-          <w:rFonts w:asciiTheme="majorHAnsi" w:hAnsiTheme="majorHAnsi" w:cstheme="majorHAnsi"/>
-          <w:sz w:val="24"/>
-          <w:szCs w:val="24"/>
-        </w:rPr>
-        <w:t xml:space="preserve"> for the final year students </w:t>
+        <w:t xml:space="preserve">, Kavarepettai for the final year students </w:t>
       </w:r>
       <w:r>
         <w:rPr>
@@ -10181,25 +9647,7 @@
           <w:sz w:val="24"/>
           <w:szCs w:val="24"/>
         </w:rPr>
-        <w:t xml:space="preserve">, </w:t>
-      </w:r>
-      <w:proofErr w:type="spellStart"/>
-      <w:r>
-        <w:rPr>
-          <w:rFonts w:asciiTheme="majorHAnsi" w:hAnsiTheme="majorHAnsi" w:cstheme="majorHAnsi"/>
-          <w:sz w:val="24"/>
-          <w:szCs w:val="24"/>
-        </w:rPr>
-        <w:t>Pandybazar</w:t>
-      </w:r>
-      <w:proofErr w:type="spellEnd"/>
-      <w:r>
-        <w:rPr>
-          <w:rFonts w:asciiTheme="majorHAnsi" w:hAnsiTheme="majorHAnsi" w:cstheme="majorHAnsi"/>
-          <w:sz w:val="24"/>
-          <w:szCs w:val="24"/>
-        </w:rPr>
-        <w:t xml:space="preserve">, Chennai for various </w:t>
+        <w:t xml:space="preserve">, Pandybazar, Chennai for various </w:t>
       </w:r>
       <w:r>
         <w:rPr>
@@ -10283,51 +9731,22 @@
         </w:rPr>
         <w:t xml:space="preserve">at </w:t>
       </w:r>
-      <w:proofErr w:type="spellStart"/>
-      <w:r>
-        <w:rPr>
-          <w:rFonts w:asciiTheme="majorHAnsi" w:hAnsiTheme="majorHAnsi" w:cstheme="majorHAnsi"/>
-          <w:b/>
-          <w:sz w:val="24"/>
-          <w:szCs w:val="24"/>
-        </w:rPr>
-        <w:t>Vels</w:t>
-      </w:r>
-      <w:proofErr w:type="spellEnd"/>
-      <w:r>
-        <w:rPr>
-          <w:rFonts w:asciiTheme="majorHAnsi" w:hAnsiTheme="majorHAnsi" w:cstheme="majorHAnsi"/>
-          <w:b/>
-          <w:sz w:val="24"/>
-          <w:szCs w:val="24"/>
-        </w:rPr>
-        <w:t xml:space="preserve"> University</w:t>
-      </w:r>
-      <w:r>
-        <w:rPr>
-          <w:rFonts w:asciiTheme="majorHAnsi" w:hAnsiTheme="majorHAnsi" w:cstheme="majorHAnsi"/>
-          <w:sz w:val="24"/>
-          <w:szCs w:val="24"/>
-        </w:rPr>
-        <w:t xml:space="preserve">, </w:t>
-      </w:r>
-      <w:proofErr w:type="spellStart"/>
-      <w:r>
-        <w:rPr>
-          <w:rFonts w:asciiTheme="majorHAnsi" w:hAnsiTheme="majorHAnsi" w:cstheme="majorHAnsi"/>
-          <w:sz w:val="24"/>
-          <w:szCs w:val="24"/>
-        </w:rPr>
-        <w:t>Pallavaram</w:t>
-      </w:r>
-      <w:proofErr w:type="spellEnd"/>
-      <w:r>
-        <w:rPr>
-          <w:rFonts w:asciiTheme="majorHAnsi" w:hAnsiTheme="majorHAnsi" w:cstheme="majorHAnsi"/>
-          <w:sz w:val="24"/>
-          <w:szCs w:val="24"/>
-        </w:rPr>
-        <w:t>, Chennai for the final year students, during March 2018.</w:t>
+      <w:r>
+        <w:rPr>
+          <w:rFonts w:asciiTheme="majorHAnsi" w:hAnsiTheme="majorHAnsi" w:cstheme="majorHAnsi"/>
+          <w:b/>
+          <w:sz w:val="24"/>
+          <w:szCs w:val="24"/>
+        </w:rPr>
+        <w:t>Vels University</w:t>
+      </w:r>
+      <w:r>
+        <w:rPr>
+          <w:rFonts w:asciiTheme="majorHAnsi" w:hAnsiTheme="majorHAnsi" w:cstheme="majorHAnsi"/>
+          <w:sz w:val="24"/>
+          <w:szCs w:val="24"/>
+        </w:rPr>
+        <w:t>, Pallavaram, Chennai for the final year students, during March 2018.</w:t>
       </w:r>
     </w:p>
     <w:p>
@@ -10507,27 +9926,15 @@
         </w:rPr>
         <w:t xml:space="preserve"> </w:t>
       </w:r>
-      <w:proofErr w:type="spellStart"/>
-      <w:r>
-        <w:rPr>
-          <w:rFonts w:asciiTheme="majorHAnsi" w:hAnsiTheme="majorHAnsi" w:cstheme="majorHAnsi"/>
-          <w:b/>
-          <w:color w:val="000000"/>
-          <w:sz w:val="24"/>
-          <w:szCs w:val="24"/>
-        </w:rPr>
-        <w:t>Magendhiran</w:t>
-      </w:r>
-      <w:proofErr w:type="spellEnd"/>
-      <w:r>
-        <w:rPr>
-          <w:rFonts w:asciiTheme="majorHAnsi" w:hAnsiTheme="majorHAnsi" w:cstheme="majorHAnsi"/>
-          <w:b/>
-          <w:color w:val="000000"/>
-          <w:sz w:val="24"/>
-          <w:szCs w:val="24"/>
-        </w:rPr>
-        <w:t xml:space="preserve"> Consultancy Services.</w:t>
+      <w:r>
+        <w:rPr>
+          <w:rFonts w:asciiTheme="majorHAnsi" w:hAnsiTheme="majorHAnsi" w:cstheme="majorHAnsi"/>
+          <w:b/>
+          <w:color w:val="000000"/>
+          <w:sz w:val="24"/>
+          <w:szCs w:val="24"/>
+        </w:rPr>
+        <w:t>Magendhiran Consultancy Services.</w:t>
       </w:r>
     </w:p>
     <w:p>
@@ -10762,23 +10169,13 @@
                 <w:szCs w:val="24"/>
               </w:rPr>
             </w:pPr>
-            <w:proofErr w:type="spellStart"/>
             <w:r>
               <w:rPr>
                 <w:rFonts w:asciiTheme="majorHAnsi" w:hAnsiTheme="majorHAnsi" w:cstheme="majorHAnsi"/>
                 <w:sz w:val="24"/>
                 <w:szCs w:val="24"/>
               </w:rPr>
-              <w:t>Azhagappa</w:t>
-            </w:r>
-            <w:proofErr w:type="spellEnd"/>
-            <w:r>
-              <w:rPr>
-                <w:rFonts w:asciiTheme="majorHAnsi" w:hAnsiTheme="majorHAnsi" w:cstheme="majorHAnsi"/>
-                <w:sz w:val="24"/>
-                <w:szCs w:val="24"/>
-              </w:rPr>
-              <w:t xml:space="preserve"> University, Karaikudi</w:t>
+              <w:t>Azhagappa University, Karaikudi</w:t>
             </w:r>
           </w:p>
         </w:tc>
@@ -10880,43 +10277,7 @@
                 <w:sz w:val="24"/>
                 <w:szCs w:val="24"/>
               </w:rPr>
-              <w:t xml:space="preserve">B.S </w:t>
-            </w:r>
-            <w:proofErr w:type="spellStart"/>
-            <w:r>
-              <w:rPr>
-                <w:rFonts w:asciiTheme="majorHAnsi" w:hAnsiTheme="majorHAnsi" w:cstheme="majorHAnsi"/>
-                <w:sz w:val="24"/>
-                <w:szCs w:val="24"/>
-              </w:rPr>
-              <w:t>Abdur</w:t>
-            </w:r>
-            <w:proofErr w:type="spellEnd"/>
-            <w:r>
-              <w:rPr>
-                <w:rFonts w:asciiTheme="majorHAnsi" w:hAnsiTheme="majorHAnsi" w:cstheme="majorHAnsi"/>
-                <w:sz w:val="24"/>
-                <w:szCs w:val="24"/>
-              </w:rPr>
-              <w:t xml:space="preserve"> Rahman Crescent University (formerly known as B.S </w:t>
-            </w:r>
-            <w:proofErr w:type="spellStart"/>
-            <w:r>
-              <w:rPr>
-                <w:rFonts w:asciiTheme="majorHAnsi" w:hAnsiTheme="majorHAnsi" w:cstheme="majorHAnsi"/>
-                <w:sz w:val="24"/>
-                <w:szCs w:val="24"/>
-              </w:rPr>
-              <w:t>Abdur</w:t>
-            </w:r>
-            <w:proofErr w:type="spellEnd"/>
-            <w:r>
-              <w:rPr>
-                <w:rFonts w:asciiTheme="majorHAnsi" w:hAnsiTheme="majorHAnsi" w:cstheme="majorHAnsi"/>
-                <w:sz w:val="24"/>
-                <w:szCs w:val="24"/>
-              </w:rPr>
-              <w:t xml:space="preserve"> Rahman Crescent Engineering College) Chennai, Anna University</w:t>
+              <w:t>B.S Abdur Rahman Crescent University (formerly known as B.S Abdur Rahman Crescent Engineering College) Chennai, Anna University</w:t>
             </w:r>
           </w:p>
         </w:tc>
@@ -10965,8 +10326,6 @@
                 <w:szCs w:val="24"/>
               </w:rPr>
             </w:pPr>
-            <w:proofErr w:type="spellStart"/>
-            <w:proofErr w:type="gramStart"/>
             <w:r>
               <w:rPr>
                 <w:rFonts w:asciiTheme="majorHAnsi" w:hAnsiTheme="majorHAnsi" w:cstheme="majorHAnsi"/>
@@ -10976,8 +10335,6 @@
               </w:rPr>
               <w:t>B.Tech</w:t>
             </w:r>
-            <w:proofErr w:type="spellEnd"/>
-            <w:proofErr w:type="gramEnd"/>
           </w:p>
         </w:tc>
         <w:tc>
@@ -11018,23 +10375,13 @@
                 <w:szCs w:val="24"/>
               </w:rPr>
             </w:pPr>
-            <w:proofErr w:type="spellStart"/>
             <w:r>
               <w:rPr>
                 <w:rFonts w:asciiTheme="majorHAnsi" w:hAnsiTheme="majorHAnsi" w:cstheme="majorHAnsi"/>
                 <w:sz w:val="24"/>
                 <w:szCs w:val="24"/>
               </w:rPr>
-              <w:t>Pallavan</w:t>
-            </w:r>
-            <w:proofErr w:type="spellEnd"/>
-            <w:r>
-              <w:rPr>
-                <w:rFonts w:asciiTheme="majorHAnsi" w:hAnsiTheme="majorHAnsi" w:cstheme="majorHAnsi"/>
-                <w:sz w:val="24"/>
-                <w:szCs w:val="24"/>
-              </w:rPr>
-              <w:t xml:space="preserve"> College of Engineering, Kanchipuram, Anna University</w:t>
+              <w:t>Pallavan College of Engineering, Kanchipuram, Anna University</w:t>
             </w:r>
           </w:p>
         </w:tc>
@@ -11132,23 +10479,13 @@
                 <w:szCs w:val="24"/>
               </w:rPr>
             </w:pPr>
-            <w:proofErr w:type="spellStart"/>
             <w:r>
               <w:rPr>
                 <w:rFonts w:asciiTheme="majorHAnsi" w:hAnsiTheme="majorHAnsi" w:cstheme="majorHAnsi"/>
                 <w:sz w:val="24"/>
                 <w:szCs w:val="24"/>
               </w:rPr>
-              <w:t>Pallavan</w:t>
-            </w:r>
-            <w:proofErr w:type="spellEnd"/>
-            <w:r>
-              <w:rPr>
-                <w:rFonts w:asciiTheme="majorHAnsi" w:hAnsiTheme="majorHAnsi" w:cstheme="majorHAnsi"/>
-                <w:sz w:val="24"/>
-                <w:szCs w:val="24"/>
-              </w:rPr>
-              <w:t xml:space="preserve"> polytechnic, Kanchipuram, DOTE</w:t>
+              <w:t>Pallavan polytechnic, Kanchipuram, DOTE</w:t>
             </w:r>
           </w:p>
         </w:tc>
@@ -11259,18 +10596,8 @@
           <w:sz w:val="24"/>
           <w:szCs w:val="24"/>
         </w:rPr>
-        <w:t xml:space="preserve">: Mr. M. </w:t>
-      </w:r>
-      <w:proofErr w:type="spellStart"/>
-      <w:r>
-        <w:rPr>
-          <w:rFonts w:asciiTheme="majorHAnsi" w:hAnsiTheme="majorHAnsi" w:cstheme="majorHAnsi"/>
-          <w:sz w:val="24"/>
-          <w:szCs w:val="24"/>
-        </w:rPr>
-        <w:t>Arulmozhivarman</w:t>
-      </w:r>
-      <w:proofErr w:type="spellEnd"/>
+        <w:t>: Mr. M. Arulmozhivarman</w:t>
+      </w:r>
     </w:p>
     <w:p>
       <w:pPr>
@@ -11460,43 +10787,7 @@
           <w:sz w:val="24"/>
           <w:szCs w:val="24"/>
         </w:rPr>
-        <w:t xml:space="preserve">Permanent Address   </w:t>
-      </w:r>
-      <w:proofErr w:type="gramStart"/>
-      <w:r>
-        <w:rPr>
-          <w:rFonts w:asciiTheme="majorHAnsi" w:hAnsiTheme="majorHAnsi" w:cstheme="majorHAnsi"/>
-          <w:sz w:val="24"/>
-          <w:szCs w:val="24"/>
-        </w:rPr>
-        <w:t xml:space="preserve">  :</w:t>
-      </w:r>
-      <w:proofErr w:type="gramEnd"/>
-      <w:r>
-        <w:rPr>
-          <w:rFonts w:asciiTheme="majorHAnsi" w:hAnsiTheme="majorHAnsi" w:cstheme="majorHAnsi"/>
-          <w:sz w:val="24"/>
-          <w:szCs w:val="24"/>
-        </w:rPr>
-        <w:t xml:space="preserve"> M.324 </w:t>
-      </w:r>
-      <w:proofErr w:type="spellStart"/>
-      <w:r>
-        <w:rPr>
-          <w:rFonts w:asciiTheme="majorHAnsi" w:hAnsiTheme="majorHAnsi" w:cstheme="majorHAnsi"/>
-          <w:sz w:val="24"/>
-          <w:szCs w:val="24"/>
-        </w:rPr>
-        <w:t>Ragaventhira</w:t>
-      </w:r>
-      <w:proofErr w:type="spellEnd"/>
-      <w:r>
-        <w:rPr>
-          <w:rFonts w:asciiTheme="majorHAnsi" w:hAnsiTheme="majorHAnsi" w:cstheme="majorHAnsi"/>
-          <w:sz w:val="24"/>
-          <w:szCs w:val="24"/>
-        </w:rPr>
-        <w:t xml:space="preserve"> Nagar,</w:t>
+        <w:t>Permanent Address     : M.324 Ragaventhira Nagar,</w:t>
       </w:r>
     </w:p>
     <w:p>
@@ -11515,43 +10806,42 @@
           <w:sz w:val="24"/>
           <w:szCs w:val="24"/>
         </w:rPr>
+        <w:t xml:space="preserve">  Sevili Medu post, Kanchipuram-631501, </w:t>
+      </w:r>
+    </w:p>
+    <w:p>
+      <w:pPr>
+        <w:spacing w:after="0" w:line="240" w:lineRule="auto"/>
+        <w:ind w:left="3600" w:right="-360" w:hanging="720"/>
+        <w:rPr>
+          <w:rFonts w:asciiTheme="majorHAnsi" w:hAnsiTheme="majorHAnsi" w:cstheme="majorHAnsi"/>
+          <w:sz w:val="24"/>
+          <w:szCs w:val="24"/>
+        </w:rPr>
+      </w:pPr>
+      <w:r>
+        <w:rPr>
+          <w:rFonts w:asciiTheme="majorHAnsi" w:hAnsiTheme="majorHAnsi" w:cstheme="majorHAnsi"/>
+          <w:sz w:val="24"/>
+          <w:szCs w:val="24"/>
+        </w:rPr>
         <w:t xml:space="preserve">  </w:t>
       </w:r>
-      <w:proofErr w:type="spellStart"/>
-      <w:r>
-        <w:rPr>
-          <w:rFonts w:asciiTheme="majorHAnsi" w:hAnsiTheme="majorHAnsi" w:cstheme="majorHAnsi"/>
-          <w:sz w:val="24"/>
-          <w:szCs w:val="24"/>
-        </w:rPr>
-        <w:t>Sevili</w:t>
-      </w:r>
-      <w:proofErr w:type="spellEnd"/>
-      <w:r>
-        <w:rPr>
-          <w:rFonts w:asciiTheme="majorHAnsi" w:hAnsiTheme="majorHAnsi" w:cstheme="majorHAnsi"/>
-          <w:sz w:val="24"/>
-          <w:szCs w:val="24"/>
-        </w:rPr>
-        <w:t xml:space="preserve"> </w:t>
-      </w:r>
-      <w:proofErr w:type="spellStart"/>
-      <w:r>
-        <w:rPr>
-          <w:rFonts w:asciiTheme="majorHAnsi" w:hAnsiTheme="majorHAnsi" w:cstheme="majorHAnsi"/>
-          <w:sz w:val="24"/>
-          <w:szCs w:val="24"/>
-        </w:rPr>
-        <w:t>Medu</w:t>
-      </w:r>
-      <w:proofErr w:type="spellEnd"/>
-      <w:r>
-        <w:rPr>
-          <w:rFonts w:asciiTheme="majorHAnsi" w:hAnsiTheme="majorHAnsi" w:cstheme="majorHAnsi"/>
-          <w:sz w:val="24"/>
-          <w:szCs w:val="24"/>
-        </w:rPr>
-        <w:t xml:space="preserve"> post, Kanchipuram-631501, </w:t>
+      <w:r>
+        <w:rPr>
+          <w:rFonts w:asciiTheme="majorHAnsi" w:hAnsiTheme="majorHAnsi" w:cstheme="majorHAnsi"/>
+          <w:sz w:val="24"/>
+          <w:szCs w:val="24"/>
+        </w:rPr>
+        <w:t>Kanchipuram District,</w:t>
+      </w:r>
+      <w:r>
+        <w:rPr>
+          <w:rFonts w:asciiTheme="majorHAnsi" w:hAnsiTheme="majorHAnsi" w:cstheme="majorHAnsi"/>
+          <w:sz w:val="24"/>
+          <w:szCs w:val="24"/>
+        </w:rPr>
+        <w:t xml:space="preserve">  </w:t>
       </w:r>
     </w:p>
     <w:p>
@@ -11570,60 +10860,7 @@
           <w:sz w:val="24"/>
           <w:szCs w:val="24"/>
         </w:rPr>
-        <w:t xml:space="preserve">  </w:t>
-      </w:r>
-      <w:r>
-        <w:rPr>
-          <w:rFonts w:asciiTheme="majorHAnsi" w:hAnsiTheme="majorHAnsi" w:cstheme="majorHAnsi"/>
-          <w:sz w:val="24"/>
-          <w:szCs w:val="24"/>
-        </w:rPr>
-        <w:t>Kanchipuram District,</w:t>
-      </w:r>
-      <w:r>
-        <w:rPr>
-          <w:rFonts w:asciiTheme="majorHAnsi" w:hAnsiTheme="majorHAnsi" w:cstheme="majorHAnsi"/>
-          <w:sz w:val="24"/>
-          <w:szCs w:val="24"/>
-        </w:rPr>
-        <w:t xml:space="preserve">  </w:t>
-      </w:r>
-    </w:p>
-    <w:p>
-      <w:pPr>
-        <w:spacing w:after="0" w:line="240" w:lineRule="auto"/>
-        <w:ind w:left="3600" w:right="-360" w:hanging="720"/>
-        <w:rPr>
-          <w:rFonts w:asciiTheme="majorHAnsi" w:hAnsiTheme="majorHAnsi" w:cstheme="majorHAnsi"/>
-          <w:sz w:val="24"/>
-          <w:szCs w:val="24"/>
-        </w:rPr>
-      </w:pPr>
-      <w:r>
-        <w:rPr>
-          <w:rFonts w:asciiTheme="majorHAnsi" w:hAnsiTheme="majorHAnsi" w:cstheme="majorHAnsi"/>
-          <w:sz w:val="24"/>
-          <w:szCs w:val="24"/>
-        </w:rPr>
-        <w:t xml:space="preserve">  </w:t>
-      </w:r>
-      <w:proofErr w:type="spellStart"/>
-      <w:r>
-        <w:rPr>
-          <w:rFonts w:asciiTheme="majorHAnsi" w:hAnsiTheme="majorHAnsi" w:cstheme="majorHAnsi"/>
-          <w:sz w:val="24"/>
-          <w:szCs w:val="24"/>
-        </w:rPr>
-        <w:t>Tamilnadu</w:t>
-      </w:r>
-      <w:proofErr w:type="spellEnd"/>
-      <w:r>
-        <w:rPr>
-          <w:rFonts w:asciiTheme="majorHAnsi" w:hAnsiTheme="majorHAnsi" w:cstheme="majorHAnsi"/>
-          <w:sz w:val="24"/>
-          <w:szCs w:val="24"/>
-        </w:rPr>
-        <w:t>, India.</w:t>
+        <w:t xml:space="preserve">  Tamilnadu, India.</w:t>
       </w:r>
       <w:r>
         <w:rPr>

</xml_diff>

<commit_message>
Update training timeline with Edunet Foundation first and fix hero visibility
</commit_message>
<xml_diff>
--- a/resume cv/Varadharajan-International trainer.docx
+++ b/resume cv/Varadharajan-International trainer.docx
@@ -1961,7 +1961,7 @@
                 <w:sz w:val="24"/>
                 <w:szCs w:val="24"/>
               </w:rPr>
-              <w:t xml:space="preserve">Edunet Foundation, </w:t>
+              <w:t>Edunet Foundation</w:t>
             </w:r>
           </w:p>
         </w:tc>
@@ -2100,6 +2100,14 @@
                 <w:szCs w:val="24"/>
               </w:rPr>
             </w:pPr>
+            <w:r>
+              <w:rPr>
+                <w:rFonts w:asciiTheme="majorHAnsi" w:hAnsiTheme="majorHAnsi" w:cstheme="majorHAnsi"/>
+                <w:sz w:val="24"/>
+                <w:szCs w:val="24"/>
+              </w:rPr>
+              <w:t>2</w:t>
+            </w:r>
           </w:p>
         </w:tc>
         <w:tc>
@@ -2306,7 +2314,7 @@
                 <w:sz w:val="24"/>
                 <w:szCs w:val="24"/>
               </w:rPr>
-              <w:t>2</w:t>
+              <w:t>3</w:t>
             </w:r>
           </w:p>
         </w:tc>
@@ -2580,7 +2588,7 @@
                 <w:sz w:val="24"/>
                 <w:szCs w:val="24"/>
               </w:rPr>
-              <w:t>3</w:t>
+              <w:t>4</w:t>
             </w:r>
           </w:p>
         </w:tc>
@@ -2746,7 +2754,7 @@
                 <w:sz w:val="24"/>
                 <w:szCs w:val="24"/>
               </w:rPr>
-              <w:t>4</w:t>
+              <w:t>5</w:t>
             </w:r>
           </w:p>
         </w:tc>
@@ -2897,7 +2905,7 @@
                 <w:sz w:val="24"/>
                 <w:szCs w:val="24"/>
               </w:rPr>
-              <w:t>5</w:t>
+              <w:t>6</w:t>
             </w:r>
           </w:p>
         </w:tc>
@@ -5146,28 +5154,6 @@
         </w:rPr>
         <w:t> Jdk1.5, AJAX, JavaScript, JSP, Spring 3.0, DAO, Hibernate 3.2, UML, Design patterns, JMS, Eclipse3.2, Oracle 10g, ANT, JUNIT, HTML, DHTML, XML, slf4, XSL, CSS, JMeter, Windows XP and UNIX.</w:t>
       </w:r>
-    </w:p>
-    <w:p>
-      <w:pPr>
-        <w:shd w:val="clear" w:color="auto" w:fill="FFFFFF"/>
-        <w:spacing w:after="0" w:line="240" w:lineRule="auto"/>
-        <w:rPr>
-          <w:rFonts w:asciiTheme="majorHAnsi" w:hAnsiTheme="majorHAnsi" w:cstheme="majorHAnsi"/>
-          <w:sz w:val="24"/>
-          <w:szCs w:val="24"/>
-        </w:rPr>
-      </w:pPr>
-    </w:p>
-    <w:p>
-      <w:pPr>
-        <w:shd w:val="clear" w:color="auto" w:fill="FFFFFF"/>
-        <w:spacing w:after="0" w:line="240" w:lineRule="auto"/>
-        <w:rPr>
-          <w:rFonts w:asciiTheme="majorHAnsi" w:hAnsiTheme="majorHAnsi" w:cstheme="majorHAnsi"/>
-          <w:sz w:val="24"/>
-          <w:szCs w:val="24"/>
-        </w:rPr>
-      </w:pPr>
     </w:p>
     <w:p>
       <w:pPr>
@@ -7947,7 +7933,6 @@
           <w:sz w:val="24"/>
           <w:szCs w:val="24"/>
         </w:rPr>
-        <w:lastRenderedPageBreak/>
         <w:t xml:space="preserve">Tagore Dental College, Chennai (Ref: Attached photo </w:t>
       </w:r>
       <w:r>
@@ -8002,6 +7987,7 @@
           <w:sz w:val="24"/>
           <w:szCs w:val="24"/>
         </w:rPr>
+        <w:lastRenderedPageBreak/>
         <w:t>Framed syllabus for autonomous colleges and Universities (Saveetha University Chennai, Sona College of Technology S</w:t>
       </w:r>
       <w:r>
@@ -9339,48 +9325,48 @@
           <w:sz w:val="24"/>
           <w:szCs w:val="24"/>
         </w:rPr>
+        <w:t>Roles and Responsibilities in the Organization (</w:t>
+      </w:r>
+      <w:r>
+        <w:rPr>
+          <w:rFonts w:asciiTheme="majorHAnsi" w:hAnsiTheme="majorHAnsi" w:cstheme="majorHAnsi"/>
+          <w:b/>
+          <w:color w:val="000000"/>
+          <w:sz w:val="24"/>
+          <w:szCs w:val="24"/>
+        </w:rPr>
+        <w:t>Magendhiran Consultancy Services)</w:t>
+      </w:r>
+      <w:r>
+        <w:rPr>
+          <w:rFonts w:asciiTheme="majorHAnsi" w:hAnsiTheme="majorHAnsi" w:cstheme="majorHAnsi"/>
+          <w:b/>
+          <w:sz w:val="24"/>
+          <w:szCs w:val="24"/>
+        </w:rPr>
+        <w:t>:</w:t>
+      </w:r>
+    </w:p>
+    <w:p>
+      <w:pPr>
+        <w:spacing w:after="0" w:line="240" w:lineRule="auto"/>
+        <w:jc w:val="both"/>
+        <w:rPr>
+          <w:rFonts w:asciiTheme="majorHAnsi" w:hAnsiTheme="majorHAnsi" w:cstheme="majorHAnsi"/>
+          <w:b/>
+          <w:color w:val="000000"/>
+          <w:sz w:val="24"/>
+          <w:szCs w:val="24"/>
+        </w:rPr>
+      </w:pPr>
+      <w:r>
+        <w:rPr>
+          <w:rFonts w:asciiTheme="majorHAnsi" w:hAnsiTheme="majorHAnsi" w:cstheme="majorHAnsi"/>
+          <w:b/>
+          <w:sz w:val="24"/>
+          <w:szCs w:val="24"/>
+        </w:rPr>
         <w:lastRenderedPageBreak/>
-        <w:t>Roles and Responsibilities in the Organization (</w:t>
-      </w:r>
-      <w:r>
-        <w:rPr>
-          <w:rFonts w:asciiTheme="majorHAnsi" w:hAnsiTheme="majorHAnsi" w:cstheme="majorHAnsi"/>
-          <w:b/>
-          <w:color w:val="000000"/>
-          <w:sz w:val="24"/>
-          <w:szCs w:val="24"/>
-        </w:rPr>
-        <w:t>Magendhiran Consultancy Services)</w:t>
-      </w:r>
-      <w:r>
-        <w:rPr>
-          <w:rFonts w:asciiTheme="majorHAnsi" w:hAnsiTheme="majorHAnsi" w:cstheme="majorHAnsi"/>
-          <w:b/>
-          <w:sz w:val="24"/>
-          <w:szCs w:val="24"/>
-        </w:rPr>
-        <w:t>:</w:t>
-      </w:r>
-    </w:p>
-    <w:p>
-      <w:pPr>
-        <w:spacing w:after="0" w:line="240" w:lineRule="auto"/>
-        <w:jc w:val="both"/>
-        <w:rPr>
-          <w:rFonts w:asciiTheme="majorHAnsi" w:hAnsiTheme="majorHAnsi" w:cstheme="majorHAnsi"/>
-          <w:b/>
-          <w:color w:val="000000"/>
-          <w:sz w:val="24"/>
-          <w:szCs w:val="24"/>
-        </w:rPr>
-      </w:pPr>
-      <w:r>
-        <w:rPr>
-          <w:rFonts w:asciiTheme="majorHAnsi" w:hAnsiTheme="majorHAnsi" w:cstheme="majorHAnsi"/>
-          <w:b/>
-          <w:sz w:val="24"/>
-          <w:szCs w:val="24"/>
-        </w:rPr>
         <w:tab/>
       </w:r>
       <w:r>

</xml_diff>

<commit_message>
Portfolio update: removed Kafka/RabbitMQ, microservices, Maven/Gradle, Mocha/Jasmine, Protractor/Karma, Heroku, and placeholder content
</commit_message>
<xml_diff>
--- a/resume cv/Varadharajan-International trainer.docx
+++ b/resume cv/Varadharajan-International trainer.docx
@@ -129,15 +129,7 @@
         </w:rPr>
       </w:pPr>
       <w:r>
-        <w:t xml:space="preserve">Results-driven Full Stack Trainer and Developer with 19 years of experience in enterprise software development and international technical training. Delivered hands-on programs across 11 countries to 6,500+ students, 700+ faculties and professionals, in partnership with global </w:t>
-      </w:r>
-      <w:proofErr w:type="spellStart"/>
-      <w:r>
-        <w:t>organisations</w:t>
-      </w:r>
-      <w:proofErr w:type="spellEnd"/>
-      <w:r>
-        <w:t xml:space="preserve"> including Amazon, Infosys, Siemens, EY, and Capgemini. Seeking to expand cross-border academic and corporate training collaborations across Asia through online and offline engagements in Java, Python, MERN, DevOps, and AI.</w:t>
+        <w:t>Results-driven Full Stack Trainer and Developer with 19 years of experience in enterprise software development and international technical training. Delivered hands-on programs across 11 countries to 6,500+ students, 700+ faculties and professionals, in partnership with global organisations including Amazon, Infosys, Siemens, EY, and Capgemini. Seeking to expand cross-border academic and corporate training collaborations across Asia through online and offline engagements in Java, Python, MERN, DevOps, and AI.</w:t>
       </w:r>
     </w:p>
     <w:p>
@@ -419,13 +411,8 @@
             <w:pPr>
               <w:spacing w:line="200" w:lineRule="exact"/>
             </w:pPr>
-            <w:proofErr w:type="spellStart"/>
-            <w:r>
-              <w:t>Edunet</w:t>
-            </w:r>
-            <w:proofErr w:type="spellEnd"/>
-            <w:r>
-              <w:t xml:space="preserve"> Foundation</w:t>
+            <w:r>
+              <w:t>Edunet Foundation</w:t>
             </w:r>
           </w:p>
         </w:tc>
@@ -468,7 +455,16 @@
               <w:spacing w:line="200" w:lineRule="exact"/>
             </w:pPr>
             <w:r>
-              <w:t>Nov 2023 - Present</w:t>
+              <w:t xml:space="preserve">Nov 2023 </w:t>
+            </w:r>
+            <w:r>
+              <w:t>–</w:t>
+            </w:r>
+            <w:r>
+              <w:t xml:space="preserve"> </w:t>
+            </w:r>
+            <w:r>
+              <w:t>May 2026</w:t>
             </w:r>
           </w:p>
         </w:tc>
@@ -485,13 +481,8 @@
             <w:pPr>
               <w:spacing w:line="200" w:lineRule="exact"/>
             </w:pPr>
-            <w:proofErr w:type="spellStart"/>
-            <w:r>
-              <w:t>Matrixx</w:t>
-            </w:r>
-            <w:proofErr w:type="spellEnd"/>
-            <w:r>
-              <w:t xml:space="preserve"> Operation Program</w:t>
+            <w:r>
+              <w:t>Matrixx Operation Program</w:t>
             </w:r>
           </w:p>
         </w:tc>
@@ -503,13 +494,8 @@
             <w:pPr>
               <w:spacing w:line="200" w:lineRule="exact"/>
             </w:pPr>
-            <w:proofErr w:type="spellStart"/>
-            <w:r>
-              <w:t>Matrixx</w:t>
-            </w:r>
-            <w:proofErr w:type="spellEnd"/>
-            <w:r>
-              <w:t xml:space="preserve"> Foundation, Technical basics, DevOps Integration Module, Monitoring &amp; Observability Real-Time Industry Use Cases</w:t>
+            <w:r>
+              <w:t>Matrixx Foundation, Technical basics, DevOps Integration Module, Monitoring &amp; Observability Real-Time Industry Use Cases</w:t>
             </w:r>
           </w:p>
         </w:tc>
@@ -617,13 +603,8 @@
             <w:pPr>
               <w:spacing w:line="200" w:lineRule="exact"/>
             </w:pPr>
-            <w:proofErr w:type="spellStart"/>
-            <w:r>
-              <w:t>EduBridge</w:t>
-            </w:r>
-            <w:proofErr w:type="spellEnd"/>
-            <w:r>
-              <w:t xml:space="preserve"> Learning India Pvt Ltd, Mumbai</w:t>
+            <w:r>
+              <w:t>EduBridge Learning India Pvt Ltd, Mumbai</w:t>
             </w:r>
           </w:p>
         </w:tc>
@@ -884,15 +865,7 @@
         </w:rPr>
       </w:pPr>
       <w:r>
-        <w:t xml:space="preserve">Foundation for Test Automation using </w:t>
-      </w:r>
-      <w:proofErr w:type="spellStart"/>
-      <w:r>
-        <w:t>Sahi</w:t>
-      </w:r>
-      <w:proofErr w:type="spellEnd"/>
-      <w:r>
-        <w:t xml:space="preserve"> Pro</w:t>
+        <w:t>Foundation for Test Automation using Sahi Pro</w:t>
       </w:r>
     </w:p>
     <w:p>
@@ -932,27 +905,7 @@
           <w:sz w:val="24"/>
           <w:szCs w:val="24"/>
         </w:rPr>
-        <w:t xml:space="preserve">Senior Java Developer – </w:t>
-      </w:r>
-      <w:proofErr w:type="spellStart"/>
-      <w:r>
-        <w:rPr>
-          <w:b/>
-          <w:bCs/>
-          <w:sz w:val="24"/>
-          <w:szCs w:val="24"/>
-        </w:rPr>
-        <w:t>Magendhiran</w:t>
-      </w:r>
-      <w:proofErr w:type="spellEnd"/>
-      <w:r>
-        <w:rPr>
-          <w:b/>
-          <w:bCs/>
-          <w:sz w:val="24"/>
-          <w:szCs w:val="24"/>
-        </w:rPr>
-        <w:t xml:space="preserve"> Consultancy Services</w:t>
+        <w:t>Senior Java Developer – Magendhiran Consultancy Services</w:t>
       </w:r>
     </w:p>
     <w:p>
@@ -981,15 +934,7 @@
         <w:ind w:left="360"/>
       </w:pPr>
       <w:r>
-        <w:t xml:space="preserve">•  Used REST APIs, </w:t>
-      </w:r>
-      <w:proofErr w:type="spellStart"/>
-      <w:r>
-        <w:t>Zipkin</w:t>
-      </w:r>
-      <w:proofErr w:type="spellEnd"/>
-      <w:r>
-        <w:t>, Swagger</w:t>
+        <w:t>•  Used REST APIs, Zipkin, Swagger</w:t>
       </w:r>
     </w:p>
     <w:p>
@@ -1025,27 +970,7 @@
           <w:sz w:val="24"/>
           <w:szCs w:val="24"/>
         </w:rPr>
-        <w:t xml:space="preserve">Java Developer – </w:t>
-      </w:r>
-      <w:proofErr w:type="spellStart"/>
-      <w:r>
-        <w:rPr>
-          <w:b/>
-          <w:bCs/>
-          <w:sz w:val="24"/>
-          <w:szCs w:val="24"/>
-        </w:rPr>
-        <w:t>Magendhiran</w:t>
-      </w:r>
-      <w:proofErr w:type="spellEnd"/>
-      <w:r>
-        <w:rPr>
-          <w:b/>
-          <w:bCs/>
-          <w:sz w:val="24"/>
-          <w:szCs w:val="24"/>
-        </w:rPr>
-        <w:t xml:space="preserve"> Consultancy Services</w:t>
+        <w:t>Java Developer – Magendhiran Consultancy Services</w:t>
       </w:r>
     </w:p>
     <w:p>
@@ -3162,15 +3087,7 @@
         </w:rPr>
       </w:pPr>
       <w:r>
-        <w:t>Framed syllabi for autonomous colleges and universities (</w:t>
-      </w:r>
-      <w:proofErr w:type="spellStart"/>
-      <w:r>
-        <w:t>Saveetha</w:t>
-      </w:r>
-      <w:proofErr w:type="spellEnd"/>
-      <w:r>
-        <w:t xml:space="preserve"> University, Sona College of Technology, Jerusalem College of Engineering)</w:t>
+        <w:t>Framed syllabi for autonomous colleges and universities (Saveetha University, Sona College of Technology, Jerusalem College of Engineering)</w:t>
       </w:r>
     </w:p>
     <w:p>
@@ -3200,23 +3117,7 @@
         <w:jc w:val="both"/>
       </w:pPr>
       <w:r>
-        <w:t xml:space="preserve">1. Varadharajan. A, </w:t>
-      </w:r>
-      <w:proofErr w:type="spellStart"/>
-      <w:r>
-        <w:t>Iyappan</w:t>
-      </w:r>
-      <w:proofErr w:type="spellEnd"/>
-      <w:r>
-        <w:t xml:space="preserve">. L and P. </w:t>
-      </w:r>
-      <w:proofErr w:type="spellStart"/>
-      <w:r>
-        <w:t>Kasinatha</w:t>
-      </w:r>
-      <w:proofErr w:type="spellEnd"/>
-      <w:r>
-        <w:t xml:space="preserve"> Pandian, Assessment on land-use changes in Coimbatore North Taluk using Image Processing and Geospatial techniques, International Journal of Engineering Research and Applications (IJERA), ISSN: 2248-9622, Vol. 2, Issue 4, pp. 233-237, July 2012.</w:t>
+        <w:t>1. Varadharajan. A, Iyappan. L and P. Kasinatha Pandian, Assessment on land-use changes in Coimbatore North Taluk using Image Processing and Geospatial techniques, International Journal of Engineering Research and Applications (IJERA), ISSN: 2248-9622, Vol. 2, Issue 4, pp. 233-237, July 2012.</w:t>
       </w:r>
     </w:p>
     <w:p>
@@ -3378,13 +3279,8 @@
             <w:tcW w:w="4111" w:type="dxa"/>
           </w:tcPr>
           <w:p>
-            <w:proofErr w:type="spellStart"/>
-            <w:r>
-              <w:t>Azhagappa</w:t>
-            </w:r>
-            <w:proofErr w:type="spellEnd"/>
-            <w:r>
-              <w:t xml:space="preserve"> University, Karaikudi</w:t>
+            <w:r>
+              <w:t>Azhagappa University, Karaikudi</w:t>
             </w:r>
           </w:p>
         </w:tc>
@@ -3433,15 +3329,7 @@
           </w:tcPr>
           <w:p>
             <w:r>
-              <w:t xml:space="preserve">B.S </w:t>
-            </w:r>
-            <w:proofErr w:type="spellStart"/>
-            <w:r>
-              <w:t>Abdur</w:t>
-            </w:r>
-            <w:proofErr w:type="spellEnd"/>
-            <w:r>
-              <w:t xml:space="preserve"> Rahman Crescent University, Chennai</w:t>
+              <w:t>B.S Abdur Rahman Crescent University, Chennai</w:t>
             </w:r>
           </w:p>
         </w:tc>
@@ -3465,8 +3353,6 @@
             <w:tcW w:w="1101" w:type="dxa"/>
           </w:tcPr>
           <w:p>
-            <w:proofErr w:type="spellStart"/>
-            <w:proofErr w:type="gramStart"/>
             <w:r>
               <w:rPr>
                 <w:b/>
@@ -3474,8 +3360,6 @@
               </w:rPr>
               <w:t>B.Tech</w:t>
             </w:r>
-            <w:proofErr w:type="spellEnd"/>
-            <w:proofErr w:type="gramEnd"/>
           </w:p>
         </w:tc>
         <w:tc>
@@ -3493,13 +3377,8 @@
             <w:tcW w:w="4111" w:type="dxa"/>
           </w:tcPr>
           <w:p>
-            <w:proofErr w:type="spellStart"/>
-            <w:r>
-              <w:t>Pallavan</w:t>
-            </w:r>
-            <w:proofErr w:type="spellEnd"/>
-            <w:r>
-              <w:t xml:space="preserve"> College of Engineering, Kanchipuram</w:t>
+            <w:r>
+              <w:t>Pallavan College of Engineering, Kanchipuram</w:t>
             </w:r>
           </w:p>
         </w:tc>
@@ -3547,13 +3426,8 @@
             <w:tcW w:w="4111" w:type="dxa"/>
           </w:tcPr>
           <w:p>
-            <w:proofErr w:type="spellStart"/>
-            <w:r>
-              <w:t>Pallavan</w:t>
-            </w:r>
-            <w:proofErr w:type="spellEnd"/>
-            <w:r>
-              <w:t xml:space="preserve"> Polytechnic, Kanchipuram</w:t>
+            <w:r>
+              <w:t>Pallavan Polytechnic, Kanchipuram</w:t>
             </w:r>
           </w:p>
         </w:tc>

</xml_diff>

<commit_message>
`Updated index.html, resume cv/Varadharajan Resume.pdf, and resume cv/Varadharajan-International trainer.docx with minor changes to formatting, text, and links.`
</commit_message>
<xml_diff>
--- a/resume cv/Varadharajan-International trainer.docx
+++ b/resume cv/Varadharajan-International trainer.docx
@@ -29,13 +29,13 @@
         <w:tblLook w:val="0000" w:firstRow="0" w:lastRow="0" w:firstColumn="0" w:lastColumn="0" w:noHBand="0" w:noVBand="0"/>
       </w:tblPr>
       <w:tblGrid>
-        <w:gridCol w:w="4019"/>
-        <w:gridCol w:w="5341"/>
+        <w:gridCol w:w="3294"/>
+        <w:gridCol w:w="6066"/>
       </w:tblGrid>
       <w:tr>
         <w:tc>
           <w:tcPr>
-            <w:tcW w:w="4111" w:type="dxa"/>
+            <w:tcW w:w="3294" w:type="dxa"/>
             <w:shd w:val="clear" w:color="auto" w:fill="auto"/>
           </w:tcPr>
           <w:p>
@@ -51,22 +51,36 @@
                 <w:sz w:val="20"/>
                 <w:szCs w:val="20"/>
               </w:rPr>
-              <w:t>📱 +91-9629914445</w:t>
-            </w:r>
-          </w:p>
-          <w:p>
-            <w:r>
-              <w:rPr>
-                <w:sz w:val="20"/>
-                <w:szCs w:val="20"/>
-              </w:rPr>
-              <w:t>📧 varadharajana@gmail.com</w:t>
-            </w:r>
-          </w:p>
-        </w:tc>
-        <w:tc>
-          <w:tcPr>
-            <w:tcW w:w="5465" w:type="dxa"/>
+              <w:t>Mobile:</w:t>
+            </w:r>
+            <w:r>
+              <w:rPr>
+                <w:sz w:val="20"/>
+                <w:szCs w:val="20"/>
+              </w:rPr>
+              <w:t xml:space="preserve"> +91-9629914445</w:t>
+            </w:r>
+          </w:p>
+          <w:p>
+            <w:r>
+              <w:rPr>
+                <w:sz w:val="20"/>
+                <w:szCs w:val="20"/>
+              </w:rPr>
+              <w:t>Email:</w:t>
+            </w:r>
+            <w:r>
+              <w:rPr>
+                <w:sz w:val="20"/>
+                <w:szCs w:val="20"/>
+              </w:rPr>
+              <w:t xml:space="preserve"> varadharajana@gmail.com</w:t>
+            </w:r>
+          </w:p>
+        </w:tc>
+        <w:tc>
+          <w:tcPr>
+            <w:tcW w:w="6066" w:type="dxa"/>
             <w:shd w:val="clear" w:color="auto" w:fill="auto"/>
           </w:tcPr>
           <w:p>
@@ -82,17 +96,53 @@
                 <w:sz w:val="20"/>
                 <w:szCs w:val="20"/>
               </w:rPr>
-              <w:t>🔗 LinkedIn: linkedin.com/in/varadharajan-arul-78877b16/</w:t>
-            </w:r>
-          </w:p>
-          <w:p>
-            <w:r>
-              <w:rPr>
-                <w:sz w:val="20"/>
-                <w:szCs w:val="20"/>
-              </w:rPr>
-              <w:t>🌐 Portfolio: varadharajan4.github.io/portfolio/</w:t>
-            </w:r>
+              <w:t xml:space="preserve">LinkedIn: </w:t>
+            </w:r>
+            <w:hyperlink r:id="rId5" w:history="1">
+              <w:r>
+                <w:rPr>
+                  <w:rStyle w:val="Hyperlink"/>
+                  <w:sz w:val="20"/>
+                  <w:szCs w:val="20"/>
+                </w:rPr>
+                <w:t>https://www.linkedin.com/in/varadharajan-arul-78877b16/</w:t>
+              </w:r>
+            </w:hyperlink>
+          </w:p>
+          <w:p>
+            <w:r>
+              <w:rPr>
+                <w:sz w:val="20"/>
+                <w:szCs w:val="20"/>
+              </w:rPr>
+              <w:t xml:space="preserve">Portfolio: </w:t>
+            </w:r>
+            <w:hyperlink r:id="rId6" w:history="1">
+              <w:r>
+                <w:rPr>
+                  <w:rStyle w:val="Hyperlink"/>
+                  <w:sz w:val="20"/>
+                  <w:szCs w:val="20"/>
+                </w:rPr>
+                <w:t>https://varadharajan4.github.i</w:t>
+              </w:r>
+              <w:r>
+                <w:rPr>
+                  <w:rStyle w:val="Hyperlink"/>
+                  <w:sz w:val="20"/>
+                  <w:szCs w:val="20"/>
+                </w:rPr>
+                <w:t>o</w:t>
+              </w:r>
+              <w:r>
+                <w:rPr>
+                  <w:rStyle w:val="Hyperlink"/>
+                  <w:sz w:val="20"/>
+                  <w:szCs w:val="20"/>
+                </w:rPr>
+                <w:t>/portfolio/</w:t>
+              </w:r>
+            </w:hyperlink>
           </w:p>
         </w:tc>
       </w:tr>
@@ -129,7 +179,21 @@
         </w:rPr>
       </w:pPr>
       <w:r>
-        <w:t>Results-driven Full Stack Trainer and Developer with 19 years of experience in enterprise software development and international technical training. Delivered hands-on programs across 11 countries to 6,500+ students, 700+ faculties and professionals, in partnership with global organisations including Amazon, Infosys, Siemens, EY, and Capgemini. Seeking to expand cross-border academic and corporate training collaborations across Asia through online and offline engagements in Java, Python, MERN, DevOps, and AI.</w:t>
+        <w:t xml:space="preserve">Results-driven Full Stack Trainer and Developer with 19 years of experience in enterprise software development and international technical training. Delivered hands-on programs across 11 countries to 6,500+ students, 700+ </w:t>
+      </w:r>
+      <w:r>
+        <w:t>faculties</w:t>
+      </w:r>
+      <w:r>
+        <w:t xml:space="preserve"> and professionals, in partnership with global </w:t>
+      </w:r>
+      <w:proofErr w:type="spellStart"/>
+      <w:r>
+        <w:t>organisations</w:t>
+      </w:r>
+      <w:proofErr w:type="spellEnd"/>
+      <w:r>
+        <w:t xml:space="preserve"> including Amazon, Infosys, Siemens, EY, and Capgemini. Seeking to expand cross-border academic and corporate training collaborations across Asia through online and offline engagements in Java, Python, MERN, DevOps, and AI.</w:t>
       </w:r>
     </w:p>
     <w:p>
@@ -195,7 +259,22 @@
         <w:t>Full Stack</w:t>
       </w:r>
       <w:r>
-        <w:t xml:space="preserve"> — Java Full Stack · Python Full Stack · MERN Stack</w:t>
+        <w:t xml:space="preserve"> — Java Full Stack</w:t>
+      </w:r>
+      <w:r>
+        <w:t xml:space="preserve"> · </w:t>
+      </w:r>
+      <w:r>
+        <w:t>Application Development</w:t>
+      </w:r>
+      <w:r>
+        <w:t xml:space="preserve"> · Python Full Stack · MERN </w:t>
+      </w:r>
+      <w:r>
+        <w:t xml:space="preserve">Full </w:t>
+      </w:r>
+      <w:r>
+        <w:t>Stack</w:t>
       </w:r>
     </w:p>
     <w:p>
@@ -258,7 +337,15 @@
         <w:t>Data &amp; AI</w:t>
       </w:r>
       <w:r>
-        <w:t xml:space="preserve"> — Python, Power BI, Machine Learning, Data Visualization, AI Prompt Engineering</w:t>
+        <w:t xml:space="preserve"> — Python, Power BI, Machine Learning, Data </w:t>
+      </w:r>
+      <w:proofErr w:type="spellStart"/>
+      <w:r>
+        <w:t>Visualisation</w:t>
+      </w:r>
+      <w:proofErr w:type="spellEnd"/>
+      <w:r>
+        <w:t>, AI Prompt Engineering</w:t>
       </w:r>
     </w:p>
     <w:p>
@@ -411,8 +498,13 @@
             <w:pPr>
               <w:spacing w:line="200" w:lineRule="exact"/>
             </w:pPr>
-            <w:r>
-              <w:t>Edunet Foundation</w:t>
+            <w:proofErr w:type="spellStart"/>
+            <w:r>
+              <w:t>Edunet</w:t>
+            </w:r>
+            <w:proofErr w:type="spellEnd"/>
+            <w:r>
+              <w:t xml:space="preserve"> Foundation</w:t>
             </w:r>
           </w:p>
         </w:tc>
@@ -481,8 +573,13 @@
             <w:pPr>
               <w:spacing w:line="200" w:lineRule="exact"/>
             </w:pPr>
-            <w:r>
-              <w:t>Matrixx Operation Program</w:t>
+            <w:proofErr w:type="spellStart"/>
+            <w:r>
+              <w:t>Matrixx</w:t>
+            </w:r>
+            <w:proofErr w:type="spellEnd"/>
+            <w:r>
+              <w:t xml:space="preserve"> Operation Program</w:t>
             </w:r>
           </w:p>
         </w:tc>
@@ -494,8 +591,19 @@
             <w:pPr>
               <w:spacing w:line="200" w:lineRule="exact"/>
             </w:pPr>
-            <w:r>
-              <w:t>Matrixx Foundation, Technical basics, DevOps Integration Module, Monitoring &amp; Observability Real-Time Industry Use Cases</w:t>
+            <w:proofErr w:type="spellStart"/>
+            <w:r>
+              <w:t>Matrixx</w:t>
+            </w:r>
+            <w:proofErr w:type="spellEnd"/>
+            <w:r>
+              <w:t xml:space="preserve"> Foundation, Technical basics, DevOps Integration Module, Monitoring &amp; Observability</w:t>
+            </w:r>
+            <w:r>
+              <w:t>,</w:t>
+            </w:r>
+            <w:r>
+              <w:t xml:space="preserve"> Real-Time Industry Use Cases</w:t>
             </w:r>
           </w:p>
         </w:tc>
@@ -603,8 +711,13 @@
             <w:pPr>
               <w:spacing w:line="200" w:lineRule="exact"/>
             </w:pPr>
-            <w:r>
-              <w:t>EduBridge Learning India Pvt Ltd, Mumbai</w:t>
+            <w:proofErr w:type="spellStart"/>
+            <w:r>
+              <w:t>EduBridge</w:t>
+            </w:r>
+            <w:proofErr w:type="spellEnd"/>
+            <w:r>
+              <w:t xml:space="preserve"> Learning India Pvt Ltd, Mumbai</w:t>
             </w:r>
           </w:p>
         </w:tc>
@@ -835,6 +948,18 @@
         <w:spacing w:after="100"/>
       </w:pPr>
       <w:r>
+        <w:t>Claude AI certification- Claude 101 and Claude Code 101</w:t>
+      </w:r>
+    </w:p>
+    <w:p>
+      <w:pPr>
+        <w:numPr>
+          <w:ilvl w:val="0"/>
+          <w:numId w:val="2"/>
+        </w:numPr>
+        <w:spacing w:after="100"/>
+      </w:pPr>
+      <w:r>
         <w:t>Data Analysis with Python · Data Visualization with Python · ML with Python · Data Science with Python · Data Science Fundamentals</w:t>
       </w:r>
     </w:p>
@@ -865,7 +990,15 @@
         </w:rPr>
       </w:pPr>
       <w:r>
-        <w:t>Foundation for Test Automation using Sahi Pro</w:t>
+        <w:t xml:space="preserve">Foundation for Test Automation using </w:t>
+      </w:r>
+      <w:proofErr w:type="spellStart"/>
+      <w:r>
+        <w:t>Sahi</w:t>
+      </w:r>
+      <w:proofErr w:type="spellEnd"/>
+      <w:r>
+        <w:t xml:space="preserve"> Pro</w:t>
       </w:r>
     </w:p>
     <w:p>
@@ -905,12 +1038,40 @@
           <w:sz w:val="24"/>
           <w:szCs w:val="24"/>
         </w:rPr>
-        <w:t>Senior Java Developer – Magendhiran Consultancy Services</w:t>
-      </w:r>
-    </w:p>
-    <w:p>
-      <w:r>
-        <w:t>Client: Regency Centers | Mar 2019 – May 2020</w:t>
+        <w:t xml:space="preserve">Senior Java Developer – </w:t>
+      </w:r>
+      <w:proofErr w:type="spellStart"/>
+      <w:r>
+        <w:rPr>
+          <w:b/>
+          <w:bCs/>
+          <w:sz w:val="24"/>
+          <w:szCs w:val="24"/>
+        </w:rPr>
+        <w:t>Magendhiran</w:t>
+      </w:r>
+      <w:proofErr w:type="spellEnd"/>
+      <w:r>
+        <w:rPr>
+          <w:b/>
+          <w:bCs/>
+          <w:sz w:val="24"/>
+          <w:szCs w:val="24"/>
+        </w:rPr>
+        <w:t xml:space="preserve"> Consultancy Services</w:t>
+      </w:r>
+    </w:p>
+    <w:p>
+      <w:r>
+        <w:t xml:space="preserve">Client: Regency </w:t>
+      </w:r>
+      <w:proofErr w:type="spellStart"/>
+      <w:r>
+        <w:t>Centres</w:t>
+      </w:r>
+      <w:proofErr w:type="spellEnd"/>
+      <w:r>
+        <w:t xml:space="preserve"> | Mar 2019 – May 2020</w:t>
       </w:r>
     </w:p>
     <w:p>
@@ -926,7 +1087,13 @@
         <w:ind w:left="360"/>
       </w:pPr>
       <w:r>
-        <w:t xml:space="preserve">•  Worked in Agile (Scrum) environment  </w:t>
+        <w:t xml:space="preserve">•  Worked in </w:t>
+      </w:r>
+      <w:r>
+        <w:t xml:space="preserve">an </w:t>
+      </w:r>
+      <w:r>
+        <w:t xml:space="preserve">Agile (Scrum) environment  </w:t>
       </w:r>
     </w:p>
     <w:p>
@@ -934,7 +1101,15 @@
         <w:ind w:left="360"/>
       </w:pPr>
       <w:r>
-        <w:t>•  Used REST APIs, Zipkin, Swagger</w:t>
+        <w:t xml:space="preserve">•  Used REST APIs, </w:t>
+      </w:r>
+      <w:proofErr w:type="spellStart"/>
+      <w:r>
+        <w:t>Zipkin</w:t>
+      </w:r>
+      <w:proofErr w:type="spellEnd"/>
+      <w:r>
+        <w:t>, Swagger</w:t>
       </w:r>
     </w:p>
     <w:p>
@@ -970,7 +1145,27 @@
           <w:sz w:val="24"/>
           <w:szCs w:val="24"/>
         </w:rPr>
-        <w:t>Java Developer – Magendhiran Consultancy Services</w:t>
+        <w:t xml:space="preserve">Java Developer – </w:t>
+      </w:r>
+      <w:proofErr w:type="spellStart"/>
+      <w:r>
+        <w:rPr>
+          <w:b/>
+          <w:bCs/>
+          <w:sz w:val="24"/>
+          <w:szCs w:val="24"/>
+        </w:rPr>
+        <w:t>Magendhiran</w:t>
+      </w:r>
+      <w:proofErr w:type="spellEnd"/>
+      <w:r>
+        <w:rPr>
+          <w:b/>
+          <w:bCs/>
+          <w:sz w:val="24"/>
+          <w:szCs w:val="24"/>
+        </w:rPr>
+        <w:t xml:space="preserve"> Consultancy Services</w:t>
       </w:r>
     </w:p>
     <w:p>
@@ -2071,7 +2266,21 @@
                 <w:sz w:val="20"/>
                 <w:szCs w:val="20"/>
               </w:rPr>
-              <w:t>Microservices (Spring Boot, Docker, K8s)</w:t>
+              <w:t xml:space="preserve">Microservices (Spring Boot, Docker, </w:t>
+            </w:r>
+            <w:r>
+              <w:rPr>
+                <w:sz w:val="20"/>
+                <w:szCs w:val="20"/>
+              </w:rPr>
+              <w:t>K8S</w:t>
+            </w:r>
+            <w:r>
+              <w:rPr>
+                <w:sz w:val="20"/>
+                <w:szCs w:val="20"/>
+              </w:rPr>
+              <w:t>)</w:t>
             </w:r>
           </w:p>
         </w:tc>
@@ -2266,7 +2475,21 @@
                 <w:sz w:val="20"/>
                 <w:szCs w:val="20"/>
               </w:rPr>
-              <w:t>Offline</w:t>
+              <w:t>O</w:t>
+            </w:r>
+            <w:r>
+              <w:rPr>
+                <w:sz w:val="20"/>
+                <w:szCs w:val="20"/>
+              </w:rPr>
+              <w:t>n</w:t>
+            </w:r>
+            <w:r>
+              <w:rPr>
+                <w:sz w:val="20"/>
+                <w:szCs w:val="20"/>
+              </w:rPr>
+              <w:t>line</w:t>
             </w:r>
           </w:p>
         </w:tc>
@@ -2878,7 +3101,21 @@
                 <w:sz w:val="20"/>
                 <w:szCs w:val="20"/>
               </w:rPr>
-              <w:t>Offline</w:t>
+              <w:t>O</w:t>
+            </w:r>
+            <w:r>
+              <w:rPr>
+                <w:sz w:val="20"/>
+                <w:szCs w:val="20"/>
+              </w:rPr>
+              <w:t>n</w:t>
+            </w:r>
+            <w:r>
+              <w:rPr>
+                <w:sz w:val="20"/>
+                <w:szCs w:val="20"/>
+              </w:rPr>
+              <w:t>line</w:t>
             </w:r>
           </w:p>
         </w:tc>
@@ -3087,7 +3324,15 @@
         </w:rPr>
       </w:pPr>
       <w:r>
-        <w:t>Framed syllabi for autonomous colleges and universities (Saveetha University, Sona College of Technology, Jerusalem College of Engineering)</w:t>
+        <w:t>Framed syllabi for autonomous colleges and universities (</w:t>
+      </w:r>
+      <w:proofErr w:type="spellStart"/>
+      <w:r>
+        <w:t>Saveetha</w:t>
+      </w:r>
+      <w:proofErr w:type="spellEnd"/>
+      <w:r>
+        <w:t xml:space="preserve"> University, Sona College of Technology, Jerusalem College of Engineering)</w:t>
       </w:r>
     </w:p>
     <w:p>
@@ -3117,7 +3362,23 @@
         <w:jc w:val="both"/>
       </w:pPr>
       <w:r>
-        <w:t>1. Varadharajan. A, Iyappan. L and P. Kasinatha Pandian, Assessment on land-use changes in Coimbatore North Taluk using Image Processing and Geospatial techniques, International Journal of Engineering Research and Applications (IJERA), ISSN: 2248-9622, Vol. 2, Issue 4, pp. 233-237, July 2012.</w:t>
+        <w:t xml:space="preserve">1. Varadharajan. A, </w:t>
+      </w:r>
+      <w:proofErr w:type="spellStart"/>
+      <w:r>
+        <w:t>Iyappan</w:t>
+      </w:r>
+      <w:proofErr w:type="spellEnd"/>
+      <w:r>
+        <w:t xml:space="preserve">. L and P. </w:t>
+      </w:r>
+      <w:proofErr w:type="spellStart"/>
+      <w:r>
+        <w:t>Kasinatha</w:t>
+      </w:r>
+      <w:proofErr w:type="spellEnd"/>
+      <w:r>
+        <w:t xml:space="preserve"> Pandian, Assessment on land-use changes in Coimbatore North Taluk using Image Processing and Geospatial techniques, International Journal of Engineering Research and Applications (IJERA), ISSN: 2248-9622, Vol. 2, Issue 4, pp. 233-237, July 2012.</w:t>
       </w:r>
     </w:p>
     <w:p>
@@ -3279,8 +3540,13 @@
             <w:tcW w:w="4111" w:type="dxa"/>
           </w:tcPr>
           <w:p>
-            <w:r>
-              <w:t>Azhagappa University, Karaikudi</w:t>
+            <w:proofErr w:type="spellStart"/>
+            <w:r>
+              <w:t>Azhagappa</w:t>
+            </w:r>
+            <w:proofErr w:type="spellEnd"/>
+            <w:r>
+              <w:t xml:space="preserve"> University, Karaikudi</w:t>
             </w:r>
           </w:p>
         </w:tc>
@@ -3329,7 +3595,15 @@
           </w:tcPr>
           <w:p>
             <w:r>
-              <w:t>B.S Abdur Rahman Crescent University, Chennai</w:t>
+              <w:t xml:space="preserve">B.S </w:t>
+            </w:r>
+            <w:proofErr w:type="spellStart"/>
+            <w:r>
+              <w:t>Abdur</w:t>
+            </w:r>
+            <w:proofErr w:type="spellEnd"/>
+            <w:r>
+              <w:t xml:space="preserve"> Rahman Crescent University, Chennai</w:t>
             </w:r>
           </w:p>
         </w:tc>
@@ -3353,6 +3627,8 @@
             <w:tcW w:w="1101" w:type="dxa"/>
           </w:tcPr>
           <w:p>
+            <w:proofErr w:type="spellStart"/>
+            <w:proofErr w:type="gramStart"/>
             <w:r>
               <w:rPr>
                 <w:b/>
@@ -3360,6 +3636,8 @@
               </w:rPr>
               <w:t>B.Tech</w:t>
             </w:r>
+            <w:proofErr w:type="spellEnd"/>
+            <w:proofErr w:type="gramEnd"/>
           </w:p>
         </w:tc>
         <w:tc>
@@ -3377,8 +3655,13 @@
             <w:tcW w:w="4111" w:type="dxa"/>
           </w:tcPr>
           <w:p>
-            <w:r>
-              <w:t>Pallavan College of Engineering, Kanchipuram</w:t>
+            <w:proofErr w:type="spellStart"/>
+            <w:r>
+              <w:t>Pallavan</w:t>
+            </w:r>
+            <w:proofErr w:type="spellEnd"/>
+            <w:r>
+              <w:t xml:space="preserve"> College of Engineering, Kanchipuram</w:t>
             </w:r>
           </w:p>
         </w:tc>
@@ -3426,8 +3709,13 @@
             <w:tcW w:w="4111" w:type="dxa"/>
           </w:tcPr>
           <w:p>
-            <w:r>
-              <w:t>Pallavan Polytechnic, Kanchipuram</w:t>
+            <w:proofErr w:type="spellStart"/>
+            <w:r>
+              <w:t>Pallavan</w:t>
+            </w:r>
+            <w:proofErr w:type="spellEnd"/>
+            <w:r>
+              <w:t xml:space="preserve"> Polytechnic, Kanchipuram</w:t>
             </w:r>
           </w:p>
         </w:tc>
@@ -4864,6 +5152,30 @@
       </w:tblBorders>
     </w:tblPr>
   </w:style>
+  <w:style w:type="character" w:styleId="UnresolvedMention">
+    <w:name w:val="Unresolved Mention"/>
+    <w:basedOn w:val="DefaultParagraphFont"/>
+    <w:uiPriority w:val="99"/>
+    <w:semiHidden/>
+    <w:unhideWhenUsed/>
+    <w:rsid w:val="00942701"/>
+    <w:rPr>
+      <w:color w:val="605E5C"/>
+      <w:shd w:val="clear" w:color="auto" w:fill="E1DFDD"/>
+    </w:rPr>
+  </w:style>
+  <w:style w:type="character" w:styleId="FollowedHyperlink">
+    <w:name w:val="FollowedHyperlink"/>
+    <w:basedOn w:val="DefaultParagraphFont"/>
+    <w:uiPriority w:val="99"/>
+    <w:semiHidden/>
+    <w:unhideWhenUsed/>
+    <w:rsid w:val="005718D6"/>
+    <w:rPr>
+      <w:color w:val="954F72" w:themeColor="followedHyperlink"/>
+      <w:u w:val="single"/>
+    </w:rPr>
+  </w:style>
 </w:styles>
 </file>
 

</xml_diff>

<commit_message>
Update resume PDFs and trainer docx
</commit_message>
<xml_diff>
--- a/resume cv/Varadharajan-International trainer.docx
+++ b/resume cv/Varadharajan-International trainer.docx
@@ -124,23 +124,7 @@
                   <w:sz w:val="20"/>
                   <w:szCs w:val="20"/>
                 </w:rPr>
-                <w:t>https://varadharajan4.github.i</w:t>
-              </w:r>
-              <w:r>
-                <w:rPr>
-                  <w:rStyle w:val="Hyperlink"/>
-                  <w:sz w:val="20"/>
-                  <w:szCs w:val="20"/>
-                </w:rPr>
-                <w:t>o</w:t>
-              </w:r>
-              <w:r>
-                <w:rPr>
-                  <w:rStyle w:val="Hyperlink"/>
-                  <w:sz w:val="20"/>
-                  <w:szCs w:val="20"/>
-                </w:rPr>
-                <w:t>/portfolio/</w:t>
+                <w:t>https://varadharajan4.github.io/portfolio/</w:t>
               </w:r>
             </w:hyperlink>
           </w:p>
@@ -185,15 +169,7 @@
         <w:t>faculties</w:t>
       </w:r>
       <w:r>
-        <w:t xml:space="preserve"> and professionals, in partnership with global </w:t>
-      </w:r>
-      <w:proofErr w:type="spellStart"/>
-      <w:r>
-        <w:t>organisations</w:t>
-      </w:r>
-      <w:proofErr w:type="spellEnd"/>
-      <w:r>
-        <w:t xml:space="preserve"> including Amazon, Infosys, Siemens, EY, and Capgemini. Seeking to expand cross-border academic and corporate training collaborations across Asia through online and offline engagements in Java, Python, MERN, DevOps, and AI.</w:t>
+        <w:t xml:space="preserve"> and professionals, in partnership with global organisations including Amazon, Infosys, Siemens, EY, and Capgemini. Seeking to expand cross-border academic and corporate training collaborations across Asia through online and offline engagements in Java, Python, MERN, DevOps, and AI.</w:t>
       </w:r>
     </w:p>
     <w:p>
@@ -339,11 +315,9 @@
       <w:r>
         <w:t xml:space="preserve"> — Python, Power BI, Machine Learning, Data </w:t>
       </w:r>
-      <w:proofErr w:type="spellStart"/>
       <w:r>
         <w:t>Visualisation</w:t>
       </w:r>
-      <w:proofErr w:type="spellEnd"/>
       <w:r>
         <w:t>, AI Prompt Engineering</w:t>
       </w:r>
@@ -498,13 +472,8 @@
             <w:pPr>
               <w:spacing w:line="200" w:lineRule="exact"/>
             </w:pPr>
-            <w:proofErr w:type="spellStart"/>
-            <w:r>
-              <w:t>Edunet</w:t>
-            </w:r>
-            <w:proofErr w:type="spellEnd"/>
-            <w:r>
-              <w:t xml:space="preserve"> Foundation</w:t>
+            <w:r>
+              <w:t>Edunet Foundation</w:t>
             </w:r>
           </w:p>
         </w:tc>
@@ -573,13 +542,8 @@
             <w:pPr>
               <w:spacing w:line="200" w:lineRule="exact"/>
             </w:pPr>
-            <w:proofErr w:type="spellStart"/>
-            <w:r>
-              <w:t>Matrixx</w:t>
-            </w:r>
-            <w:proofErr w:type="spellEnd"/>
-            <w:r>
-              <w:t xml:space="preserve"> Operation Program</w:t>
+            <w:r>
+              <w:t>Matrixx Operation Program</w:t>
             </w:r>
           </w:p>
         </w:tc>
@@ -591,13 +555,8 @@
             <w:pPr>
               <w:spacing w:line="200" w:lineRule="exact"/>
             </w:pPr>
-            <w:proofErr w:type="spellStart"/>
-            <w:r>
-              <w:t>Matrixx</w:t>
-            </w:r>
-            <w:proofErr w:type="spellEnd"/>
-            <w:r>
-              <w:t xml:space="preserve"> Foundation, Technical basics, DevOps Integration Module, Monitoring &amp; Observability</w:t>
+            <w:r>
+              <w:t>Matrixx Foundation, Technical basics, DevOps Integration Module, Monitoring &amp; Observability</w:t>
             </w:r>
             <w:r>
               <w:t>,</w:t>
@@ -711,13 +670,8 @@
             <w:pPr>
               <w:spacing w:line="200" w:lineRule="exact"/>
             </w:pPr>
-            <w:proofErr w:type="spellStart"/>
-            <w:r>
-              <w:t>EduBridge</w:t>
-            </w:r>
-            <w:proofErr w:type="spellEnd"/>
-            <w:r>
-              <w:t xml:space="preserve"> Learning India Pvt Ltd, Mumbai</w:t>
+            <w:r>
+              <w:t>EduBridge Learning India Pvt Ltd, Mumbai</w:t>
             </w:r>
           </w:p>
         </w:tc>
@@ -990,15 +944,7 @@
         </w:rPr>
       </w:pPr>
       <w:r>
-        <w:t xml:space="preserve">Foundation for Test Automation using </w:t>
-      </w:r>
-      <w:proofErr w:type="spellStart"/>
-      <w:r>
-        <w:t>Sahi</w:t>
-      </w:r>
-      <w:proofErr w:type="spellEnd"/>
-      <w:r>
-        <w:t xml:space="preserve"> Pro</w:t>
+        <w:t>Foundation for Test Automation using Sahi Pro</w:t>
       </w:r>
     </w:p>
     <w:p>
@@ -1038,38 +984,16 @@
           <w:sz w:val="24"/>
           <w:szCs w:val="24"/>
         </w:rPr>
-        <w:t xml:space="preserve">Senior Java Developer – </w:t>
-      </w:r>
-      <w:proofErr w:type="spellStart"/>
-      <w:r>
-        <w:rPr>
-          <w:b/>
-          <w:bCs/>
-          <w:sz w:val="24"/>
-          <w:szCs w:val="24"/>
-        </w:rPr>
-        <w:t>Magendhiran</w:t>
-      </w:r>
-      <w:proofErr w:type="spellEnd"/>
-      <w:r>
-        <w:rPr>
-          <w:b/>
-          <w:bCs/>
-          <w:sz w:val="24"/>
-          <w:szCs w:val="24"/>
-        </w:rPr>
-        <w:t xml:space="preserve"> Consultancy Services</w:t>
+        <w:t>Senior Java Developer – Magendhiran Consultancy Services</w:t>
       </w:r>
     </w:p>
     <w:p>
       <w:r>
         <w:t xml:space="preserve">Client: Regency </w:t>
       </w:r>
-      <w:proofErr w:type="spellStart"/>
       <w:r>
         <w:t>Centres</w:t>
       </w:r>
-      <w:proofErr w:type="spellEnd"/>
       <w:r>
         <w:t xml:space="preserve"> | Mar 2019 – May 2020</w:t>
       </w:r>
@@ -1101,15 +1025,7 @@
         <w:ind w:left="360"/>
       </w:pPr>
       <w:r>
-        <w:t xml:space="preserve">•  Used REST APIs, </w:t>
-      </w:r>
-      <w:proofErr w:type="spellStart"/>
-      <w:r>
-        <w:t>Zipkin</w:t>
-      </w:r>
-      <w:proofErr w:type="spellEnd"/>
-      <w:r>
-        <w:t>, Swagger</w:t>
+        <w:t>•  Used REST APIs, Zipkin, Swagger</w:t>
       </w:r>
     </w:p>
     <w:p>
@@ -1145,27 +1061,7 @@
           <w:sz w:val="24"/>
           <w:szCs w:val="24"/>
         </w:rPr>
-        <w:t xml:space="preserve">Java Developer – </w:t>
-      </w:r>
-      <w:proofErr w:type="spellStart"/>
-      <w:r>
-        <w:rPr>
-          <w:b/>
-          <w:bCs/>
-          <w:sz w:val="24"/>
-          <w:szCs w:val="24"/>
-        </w:rPr>
-        <w:t>Magendhiran</w:t>
-      </w:r>
-      <w:proofErr w:type="spellEnd"/>
-      <w:r>
-        <w:rPr>
-          <w:b/>
-          <w:bCs/>
-          <w:sz w:val="24"/>
-          <w:szCs w:val="24"/>
-        </w:rPr>
-        <w:t xml:space="preserve"> Consultancy Services</w:t>
+        <w:t>Java Developer – Magendhiran Consultancy Services</w:t>
       </w:r>
     </w:p>
     <w:p>
@@ -2155,7 +2051,21 @@
                 <w:sz w:val="20"/>
                 <w:szCs w:val="20"/>
               </w:rPr>
-              <w:t>Online</w:t>
+              <w:t>O</w:t>
+            </w:r>
+            <w:r>
+              <w:rPr>
+                <w:sz w:val="20"/>
+                <w:szCs w:val="20"/>
+              </w:rPr>
+              <w:t>ff</w:t>
+            </w:r>
+            <w:r>
+              <w:rPr>
+                <w:sz w:val="20"/>
+                <w:szCs w:val="20"/>
+              </w:rPr>
+              <w:t>line</w:t>
             </w:r>
           </w:p>
         </w:tc>
@@ -2482,7 +2392,7 @@
                 <w:sz w:val="20"/>
                 <w:szCs w:val="20"/>
               </w:rPr>
-              <w:t>n</w:t>
+              <w:t>ff</w:t>
             </w:r>
             <w:r>
               <w:rPr>
@@ -3324,15 +3234,7 @@
         </w:rPr>
       </w:pPr>
       <w:r>
-        <w:t>Framed syllabi for autonomous colleges and universities (</w:t>
-      </w:r>
-      <w:proofErr w:type="spellStart"/>
-      <w:r>
-        <w:t>Saveetha</w:t>
-      </w:r>
-      <w:proofErr w:type="spellEnd"/>
-      <w:r>
-        <w:t xml:space="preserve"> University, Sona College of Technology, Jerusalem College of Engineering)</w:t>
+        <w:t>Framed syllabi for autonomous colleges and universities (Saveetha University, Sona College of Technology, Jerusalem College of Engineering)</w:t>
       </w:r>
     </w:p>
     <w:p>
@@ -3362,23 +3264,7 @@
         <w:jc w:val="both"/>
       </w:pPr>
       <w:r>
-        <w:t xml:space="preserve">1. Varadharajan. A, </w:t>
-      </w:r>
-      <w:proofErr w:type="spellStart"/>
-      <w:r>
-        <w:t>Iyappan</w:t>
-      </w:r>
-      <w:proofErr w:type="spellEnd"/>
-      <w:r>
-        <w:t xml:space="preserve">. L and P. </w:t>
-      </w:r>
-      <w:proofErr w:type="spellStart"/>
-      <w:r>
-        <w:t>Kasinatha</w:t>
-      </w:r>
-      <w:proofErr w:type="spellEnd"/>
-      <w:r>
-        <w:t xml:space="preserve"> Pandian, Assessment on land-use changes in Coimbatore North Taluk using Image Processing and Geospatial techniques, International Journal of Engineering Research and Applications (IJERA), ISSN: 2248-9622, Vol. 2, Issue 4, pp. 233-237, July 2012.</w:t>
+        <w:t>1. Varadharajan. A, Iyappan. L and P. Kasinatha Pandian, Assessment on land-use changes in Coimbatore North Taluk using Image Processing and Geospatial techniques, International Journal of Engineering Research and Applications (IJERA), ISSN: 2248-9622, Vol. 2, Issue 4, pp. 233-237, July 2012.</w:t>
       </w:r>
     </w:p>
     <w:p>
@@ -3540,13 +3426,8 @@
             <w:tcW w:w="4111" w:type="dxa"/>
           </w:tcPr>
           <w:p>
-            <w:proofErr w:type="spellStart"/>
-            <w:r>
-              <w:t>Azhagappa</w:t>
-            </w:r>
-            <w:proofErr w:type="spellEnd"/>
-            <w:r>
-              <w:t xml:space="preserve"> University, Karaikudi</w:t>
+            <w:r>
+              <w:t>Azhagappa University, Karaikudi</w:t>
             </w:r>
           </w:p>
         </w:tc>
@@ -3595,15 +3476,7 @@
           </w:tcPr>
           <w:p>
             <w:r>
-              <w:t xml:space="preserve">B.S </w:t>
-            </w:r>
-            <w:proofErr w:type="spellStart"/>
-            <w:r>
-              <w:t>Abdur</w:t>
-            </w:r>
-            <w:proofErr w:type="spellEnd"/>
-            <w:r>
-              <w:t xml:space="preserve"> Rahman Crescent University, Chennai</w:t>
+              <w:t>B.S Abdur Rahman Crescent University, Chennai</w:t>
             </w:r>
           </w:p>
         </w:tc>
@@ -3627,8 +3500,6 @@
             <w:tcW w:w="1101" w:type="dxa"/>
           </w:tcPr>
           <w:p>
-            <w:proofErr w:type="spellStart"/>
-            <w:proofErr w:type="gramStart"/>
             <w:r>
               <w:rPr>
                 <w:b/>
@@ -3636,8 +3507,6 @@
               </w:rPr>
               <w:t>B.Tech</w:t>
             </w:r>
-            <w:proofErr w:type="spellEnd"/>
-            <w:proofErr w:type="gramEnd"/>
           </w:p>
         </w:tc>
         <w:tc>
@@ -3655,13 +3524,8 @@
             <w:tcW w:w="4111" w:type="dxa"/>
           </w:tcPr>
           <w:p>
-            <w:proofErr w:type="spellStart"/>
-            <w:r>
-              <w:t>Pallavan</w:t>
-            </w:r>
-            <w:proofErr w:type="spellEnd"/>
-            <w:r>
-              <w:t xml:space="preserve"> College of Engineering, Kanchipuram</w:t>
+            <w:r>
+              <w:t>Pallavan College of Engineering, Kanchipuram</w:t>
             </w:r>
           </w:p>
         </w:tc>
@@ -3709,13 +3573,8 @@
             <w:tcW w:w="4111" w:type="dxa"/>
           </w:tcPr>
           <w:p>
-            <w:proofErr w:type="spellStart"/>
-            <w:r>
-              <w:t>Pallavan</w:t>
-            </w:r>
-            <w:proofErr w:type="spellEnd"/>
-            <w:r>
-              <w:t xml:space="preserve"> Polytechnic, Kanchipuram</w:t>
+            <w:r>
+              <w:t>Pallavan Polytechnic, Kanchipuram</w:t>
             </w:r>
           </w:p>
         </w:tc>

</xml_diff>

<commit_message>
Update index.html and resume files
</commit_message>
<xml_diff>
--- a/resume cv/Varadharajan-International trainer.docx
+++ b/resume cv/Varadharajan-International trainer.docx
@@ -594,6 +594,9 @@
             <w:r>
               <w:t>Dec 2024</w:t>
             </w:r>
+            <w:r>
+              <w:t xml:space="preserve"> (8 days)</w:t>
+            </w:r>
           </w:p>
         </w:tc>
       </w:tr>
@@ -716,6 +719,9 @@
             <w:r>
               <w:t>Feb 2022 - Oct 2023</w:t>
             </w:r>
+            <w:r>
+              <w:t xml:space="preserve"> (1 year, 8months)</w:t>
+            </w:r>
           </w:p>
         </w:tc>
       </w:tr>
@@ -793,7 +799,7 @@
               <w:spacing w:line="200" w:lineRule="exact"/>
             </w:pPr>
             <w:r>
-              <w:t>TEC Consultancy Services, Chennai</w:t>
+              <w:t>MCS Mapping Consultancy Services, India</w:t>
             </w:r>
           </w:p>
         </w:tc>
@@ -806,7 +812,7 @@
               <w:spacing w:line="200" w:lineRule="exact"/>
             </w:pPr>
             <w:r>
-              <w:t>Programming Languages, Basic Concepts, and DB</w:t>
+              <w:t>Java Domain, DevOps, Testing and Cloud technologies</w:t>
             </w:r>
           </w:p>
         </w:tc>
@@ -817,12 +823,77 @@
           <w:p>
             <w:pPr>
               <w:spacing w:line="200" w:lineRule="exact"/>
-            </w:pPr>
-            <w:r>
               <w:rPr>
                 <w:b/>
                 <w:bCs/>
               </w:rPr>
+            </w:pPr>
+            <w:r>
+              <w:rPr>
+                <w:b/>
+                <w:bCs/>
+              </w:rPr>
+              <w:t xml:space="preserve">Senior Developer &amp; Training Manager </w:t>
+            </w:r>
+          </w:p>
+        </w:tc>
+        <w:tc>
+          <w:tcPr>
+            <w:tcW w:w="2118" w:type="dxa"/>
+          </w:tcPr>
+          <w:p>
+            <w:pPr>
+              <w:spacing w:line="200" w:lineRule="exact"/>
+            </w:pPr>
+            <w:r>
+              <w:t>Apr 2014 – May 2020 (6 years)</w:t>
+            </w:r>
+          </w:p>
+        </w:tc>
+      </w:tr>
+      <w:tr>
+        <w:trPr>
+          <w:trHeight w:val="697"/>
+        </w:trPr>
+        <w:tc>
+          <w:tcPr>
+            <w:tcW w:w="2506" w:type="dxa"/>
+          </w:tcPr>
+          <w:p>
+            <w:pPr>
+              <w:spacing w:line="200" w:lineRule="exact"/>
+            </w:pPr>
+            <w:r>
+              <w:t>TEC Consultancy Services, Chennai</w:t>
+            </w:r>
+          </w:p>
+        </w:tc>
+        <w:tc>
+          <w:tcPr>
+            <w:tcW w:w="4123" w:type="dxa"/>
+          </w:tcPr>
+          <w:p>
+            <w:pPr>
+              <w:spacing w:line="200" w:lineRule="exact"/>
+            </w:pPr>
+            <w:r>
+              <w:t>Programming Languages, Basic Concepts, and DB</w:t>
+            </w:r>
+          </w:p>
+        </w:tc>
+        <w:tc>
+          <w:tcPr>
+            <w:tcW w:w="1276" w:type="dxa"/>
+          </w:tcPr>
+          <w:p>
+            <w:pPr>
+              <w:spacing w:line="200" w:lineRule="exact"/>
+            </w:pPr>
+            <w:r>
+              <w:rPr>
+                <w:b/>
+                <w:bCs/>
+              </w:rPr>
               <w:t>Corporate Trainer</w:t>
             </w:r>
           </w:p>
@@ -836,7 +907,28 @@
               <w:spacing w:line="200" w:lineRule="exact"/>
             </w:pPr>
             <w:r>
-              <w:t>Aug 2008 - Dec 2013</w:t>
+              <w:t>A</w:t>
+            </w:r>
+            <w:r>
+              <w:t>pr</w:t>
+            </w:r>
+            <w:r>
+              <w:t xml:space="preserve"> 200</w:t>
+            </w:r>
+            <w:r>
+              <w:t>5</w:t>
+            </w:r>
+            <w:r>
+              <w:t xml:space="preserve"> - </w:t>
+            </w:r>
+            <w:r>
+              <w:t>May</w:t>
+            </w:r>
+            <w:r>
+              <w:t xml:space="preserve"> 20</w:t>
+            </w:r>
+            <w:r>
+              <w:t>06</w:t>
             </w:r>
           </w:p>
         </w:tc>
@@ -875,7 +967,6 @@
           <w:sz w:val="32"/>
           <w:szCs w:val="32"/>
         </w:rPr>
-        <w:lastRenderedPageBreak/>
         <w:t>TECHNICAL CERTIFICATIONS</w:t>
       </w:r>
     </w:p>
@@ -2642,6 +2733,7 @@
                 <w:sz w:val="20"/>
                 <w:szCs w:val="20"/>
               </w:rPr>
+              <w:lastRenderedPageBreak/>
               <w:t>9</w:t>
             </w:r>
           </w:p>
@@ -3117,7 +3209,6 @@
           <w:sz w:val="32"/>
           <w:szCs w:val="32"/>
         </w:rPr>
-        <w:lastRenderedPageBreak/>
         <w:t>ACADEMIC EXPERIENCE &amp; ACHIEVEMENTS</w:t>
       </w:r>
     </w:p>

</xml_diff>

<commit_message>
Update resume PDF and trainer documents
</commit_message>
<xml_diff>
--- a/resume cv/Varadharajan-International trainer.docx
+++ b/resume cv/Varadharajan-International trainer.docx
@@ -169,7 +169,15 @@
         <w:t>faculties</w:t>
       </w:r>
       <w:r>
-        <w:t xml:space="preserve"> and professionals, in partnership with global organisations including Amazon, Infosys, Siemens, EY, and Capgemini. Seeking to expand cross-border academic and corporate training collaborations across Asia through online and offline engagements in Java, Python, MERN, DevOps, and AI.</w:t>
+        <w:t xml:space="preserve"> and professionals, in partnership with global </w:t>
+      </w:r>
+      <w:proofErr w:type="spellStart"/>
+      <w:r>
+        <w:t>organisations</w:t>
+      </w:r>
+      <w:proofErr w:type="spellEnd"/>
+      <w:r>
+        <w:t xml:space="preserve"> including Amazon, Infosys, Siemens, EY, and Capgemini. Seeking to expand cross-border academic and corporate training collaborations across Asia through online and offline engagements in Java, Python, MERN, DevOps, and AI.</w:t>
       </w:r>
     </w:p>
     <w:p>
@@ -315,9 +323,11 @@
       <w:r>
         <w:t xml:space="preserve"> — Python, Power BI, Machine Learning, Data </w:t>
       </w:r>
+      <w:proofErr w:type="spellStart"/>
       <w:r>
         <w:t>Visualisation</w:t>
       </w:r>
+      <w:proofErr w:type="spellEnd"/>
       <w:r>
         <w:t>, AI Prompt Engineering</w:t>
       </w:r>
@@ -472,8 +482,13 @@
             <w:pPr>
               <w:spacing w:line="200" w:lineRule="exact"/>
             </w:pPr>
-            <w:r>
-              <w:t>Edunet Foundation</w:t>
+            <w:proofErr w:type="spellStart"/>
+            <w:r>
+              <w:t>Edunet</w:t>
+            </w:r>
+            <w:proofErr w:type="spellEnd"/>
+            <w:r>
+              <w:t xml:space="preserve"> Foundation</w:t>
             </w:r>
           </w:p>
         </w:tc>
@@ -542,8 +557,13 @@
             <w:pPr>
               <w:spacing w:line="200" w:lineRule="exact"/>
             </w:pPr>
-            <w:r>
-              <w:t>Matrixx Operation Program</w:t>
+            <w:proofErr w:type="spellStart"/>
+            <w:r>
+              <w:t>Matrixx</w:t>
+            </w:r>
+            <w:proofErr w:type="spellEnd"/>
+            <w:r>
+              <w:t xml:space="preserve"> Operation Program</w:t>
             </w:r>
           </w:p>
         </w:tc>
@@ -555,8 +575,13 @@
             <w:pPr>
               <w:spacing w:line="200" w:lineRule="exact"/>
             </w:pPr>
-            <w:r>
-              <w:t>Matrixx Foundation, Technical basics, DevOps Integration Module, Monitoring &amp; Observability</w:t>
+            <w:proofErr w:type="spellStart"/>
+            <w:r>
+              <w:t>Matrixx</w:t>
+            </w:r>
+            <w:proofErr w:type="spellEnd"/>
+            <w:r>
+              <w:t xml:space="preserve"> Foundation, Technical basics, DevOps Integration Module, Monitoring &amp; Observability</w:t>
             </w:r>
             <w:r>
               <w:t>,</w:t>
@@ -673,8 +698,13 @@
             <w:pPr>
               <w:spacing w:line="200" w:lineRule="exact"/>
             </w:pPr>
-            <w:r>
-              <w:t>EduBridge Learning India Pvt Ltd, Mumbai</w:t>
+            <w:proofErr w:type="spellStart"/>
+            <w:r>
+              <w:t>EduBridge</w:t>
+            </w:r>
+            <w:proofErr w:type="spellEnd"/>
+            <w:r>
+              <w:t xml:space="preserve"> Learning India Pvt Ltd, Mumbai</w:t>
             </w:r>
           </w:p>
         </w:tc>
@@ -934,16 +964,6 @@
         </w:tc>
       </w:tr>
     </w:tbl>
-    <w:p>
-      <w:pPr>
-        <w:spacing w:after="200"/>
-      </w:pPr>
-    </w:p>
-    <w:p>
-      <w:pPr>
-        <w:spacing w:after="200"/>
-      </w:pPr>
-    </w:p>
     <w:p>
       <w:pPr>
         <w:pBdr>
@@ -967,6 +987,7 @@
           <w:sz w:val="32"/>
           <w:szCs w:val="32"/>
         </w:rPr>
+        <w:lastRenderedPageBreak/>
         <w:t>TECHNICAL CERTIFICATIONS</w:t>
       </w:r>
     </w:p>
@@ -1035,7 +1056,15 @@
         </w:rPr>
       </w:pPr>
       <w:r>
-        <w:t>Foundation for Test Automation using Sahi Pro</w:t>
+        <w:t xml:space="preserve">Foundation for Test Automation using </w:t>
+      </w:r>
+      <w:proofErr w:type="spellStart"/>
+      <w:r>
+        <w:t>Sahi</w:t>
+      </w:r>
+      <w:proofErr w:type="spellEnd"/>
+      <w:r>
+        <w:t xml:space="preserve"> Pro</w:t>
       </w:r>
     </w:p>
     <w:p>
@@ -1075,16 +1104,38 @@
           <w:sz w:val="24"/>
           <w:szCs w:val="24"/>
         </w:rPr>
-        <w:t>Senior Java Developer – Magendhiran Consultancy Services</w:t>
+        <w:t xml:space="preserve">Senior Java Developer – </w:t>
+      </w:r>
+      <w:proofErr w:type="spellStart"/>
+      <w:r>
+        <w:rPr>
+          <w:b/>
+          <w:bCs/>
+          <w:sz w:val="24"/>
+          <w:szCs w:val="24"/>
+        </w:rPr>
+        <w:t>Magendhiran</w:t>
+      </w:r>
+      <w:proofErr w:type="spellEnd"/>
+      <w:r>
+        <w:rPr>
+          <w:b/>
+          <w:bCs/>
+          <w:sz w:val="24"/>
+          <w:szCs w:val="24"/>
+        </w:rPr>
+        <w:t xml:space="preserve"> Consultancy Services</w:t>
       </w:r>
     </w:p>
     <w:p>
       <w:r>
         <w:t xml:space="preserve">Client: Regency </w:t>
       </w:r>
+      <w:proofErr w:type="spellStart"/>
       <w:r>
         <w:t>Centres</w:t>
       </w:r>
+      <w:proofErr w:type="spellEnd"/>
       <w:r>
         <w:t xml:space="preserve"> | Mar 2019 – May 2020</w:t>
       </w:r>
@@ -1116,7 +1167,15 @@
         <w:ind w:left="360"/>
       </w:pPr>
       <w:r>
-        <w:t>•  Used REST APIs, Zipkin, Swagger</w:t>
+        <w:t xml:space="preserve">•  Used REST APIs, </w:t>
+      </w:r>
+      <w:proofErr w:type="spellStart"/>
+      <w:r>
+        <w:t>Zipkin</w:t>
+      </w:r>
+      <w:proofErr w:type="spellEnd"/>
+      <w:r>
+        <w:t>, Swagger</w:t>
       </w:r>
     </w:p>
     <w:p>
@@ -1152,7 +1211,27 @@
           <w:sz w:val="24"/>
           <w:szCs w:val="24"/>
         </w:rPr>
-        <w:t>Java Developer – Magendhiran Consultancy Services</w:t>
+        <w:t xml:space="preserve">Java Developer – </w:t>
+      </w:r>
+      <w:proofErr w:type="spellStart"/>
+      <w:r>
+        <w:rPr>
+          <w:b/>
+          <w:bCs/>
+          <w:sz w:val="24"/>
+          <w:szCs w:val="24"/>
+        </w:rPr>
+        <w:t>Magendhiran</w:t>
+      </w:r>
+      <w:proofErr w:type="spellEnd"/>
+      <w:r>
+        <w:rPr>
+          <w:b/>
+          <w:bCs/>
+          <w:sz w:val="24"/>
+          <w:szCs w:val="24"/>
+        </w:rPr>
+        <w:t xml:space="preserve"> Consultancy Services</w:t>
       </w:r>
     </w:p>
     <w:p>
@@ -2733,7 +2812,6 @@
                 <w:sz w:val="20"/>
                 <w:szCs w:val="20"/>
               </w:rPr>
-              <w:lastRenderedPageBreak/>
               <w:t>9</w:t>
             </w:r>
           </w:p>
@@ -3209,6 +3287,7 @@
           <w:sz w:val="32"/>
           <w:szCs w:val="32"/>
         </w:rPr>
+        <w:lastRenderedPageBreak/>
         <w:t>ACADEMIC EXPERIENCE &amp; ACHIEVEMENTS</w:t>
       </w:r>
     </w:p>
@@ -3325,7 +3404,15 @@
         </w:rPr>
       </w:pPr>
       <w:r>
-        <w:t>Framed syllabi for autonomous colleges and universities (Saveetha University, Sona College of Technology, Jerusalem College of Engineering)</w:t>
+        <w:t>Framed syllabi for autonomous colleges and universities (</w:t>
+      </w:r>
+      <w:proofErr w:type="spellStart"/>
+      <w:r>
+        <w:t>Saveetha</w:t>
+      </w:r>
+      <w:proofErr w:type="spellEnd"/>
+      <w:r>
+        <w:t xml:space="preserve"> University, Sona College of Technology, Jerusalem College of Engineering)</w:t>
       </w:r>
     </w:p>
     <w:p>
@@ -3355,7 +3442,23 @@
         <w:jc w:val="both"/>
       </w:pPr>
       <w:r>
-        <w:t>1. Varadharajan. A, Iyappan. L and P. Kasinatha Pandian, Assessment on land-use changes in Coimbatore North Taluk using Image Processing and Geospatial techniques, International Journal of Engineering Research and Applications (IJERA), ISSN: 2248-9622, Vol. 2, Issue 4, pp. 233-237, July 2012.</w:t>
+        <w:t xml:space="preserve">1. Varadharajan. A, </w:t>
+      </w:r>
+      <w:proofErr w:type="spellStart"/>
+      <w:r>
+        <w:t>Iyappan</w:t>
+      </w:r>
+      <w:proofErr w:type="spellEnd"/>
+      <w:r>
+        <w:t xml:space="preserve">. L and P. </w:t>
+      </w:r>
+      <w:proofErr w:type="spellStart"/>
+      <w:r>
+        <w:t>Kasinatha</w:t>
+      </w:r>
+      <w:proofErr w:type="spellEnd"/>
+      <w:r>
+        <w:t xml:space="preserve"> Pandian, Assessment on land-use changes in Coimbatore North Taluk using Image Processing and Geospatial techniques, International Journal of Engineering Research and Applications (IJERA), ISSN: 2248-9622, Vol. 2, Issue 4, pp. 233-237, July 2012.</w:t>
       </w:r>
     </w:p>
     <w:p>
@@ -3517,8 +3620,13 @@
             <w:tcW w:w="4111" w:type="dxa"/>
           </w:tcPr>
           <w:p>
-            <w:r>
-              <w:t>Azhagappa University, Karaikudi</w:t>
+            <w:proofErr w:type="spellStart"/>
+            <w:r>
+              <w:t>Azhagappa</w:t>
+            </w:r>
+            <w:proofErr w:type="spellEnd"/>
+            <w:r>
+              <w:t xml:space="preserve"> University, Karaikudi</w:t>
             </w:r>
           </w:p>
         </w:tc>
@@ -3567,7 +3675,15 @@
           </w:tcPr>
           <w:p>
             <w:r>
-              <w:t>B.S Abdur Rahman Crescent University, Chennai</w:t>
+              <w:t xml:space="preserve">B.S </w:t>
+            </w:r>
+            <w:proofErr w:type="spellStart"/>
+            <w:r>
+              <w:t>Abdur</w:t>
+            </w:r>
+            <w:proofErr w:type="spellEnd"/>
+            <w:r>
+              <w:t xml:space="preserve"> Rahman Crescent University, Chennai</w:t>
             </w:r>
           </w:p>
         </w:tc>
@@ -3591,6 +3707,8 @@
             <w:tcW w:w="1101" w:type="dxa"/>
           </w:tcPr>
           <w:p>
+            <w:proofErr w:type="spellStart"/>
+            <w:proofErr w:type="gramStart"/>
             <w:r>
               <w:rPr>
                 <w:b/>
@@ -3598,6 +3716,8 @@
               </w:rPr>
               <w:t>B.Tech</w:t>
             </w:r>
+            <w:proofErr w:type="spellEnd"/>
+            <w:proofErr w:type="gramEnd"/>
           </w:p>
         </w:tc>
         <w:tc>
@@ -3615,8 +3735,13 @@
             <w:tcW w:w="4111" w:type="dxa"/>
           </w:tcPr>
           <w:p>
-            <w:r>
-              <w:t>Pallavan College of Engineering, Kanchipuram</w:t>
+            <w:proofErr w:type="spellStart"/>
+            <w:r>
+              <w:t>Pallavan</w:t>
+            </w:r>
+            <w:proofErr w:type="spellEnd"/>
+            <w:r>
+              <w:t xml:space="preserve"> College of Engineering, Kanchipuram</w:t>
             </w:r>
           </w:p>
         </w:tc>
@@ -3664,8 +3789,13 @@
             <w:tcW w:w="4111" w:type="dxa"/>
           </w:tcPr>
           <w:p>
-            <w:r>
-              <w:t>Pallavan Polytechnic, Kanchipuram</w:t>
+            <w:proofErr w:type="spellStart"/>
+            <w:r>
+              <w:t>Pallavan</w:t>
+            </w:r>
+            <w:proofErr w:type="spellEnd"/>
+            <w:r>
+              <w:t xml:space="preserve"> Polytechnic, Kanchipuram</w:t>
             </w:r>
           </w:p>
         </w:tc>

</xml_diff>

<commit_message>
Update resume PDF and trainer docx
</commit_message>
<xml_diff>
--- a/resume cv/Varadharajan-International trainer.docx
+++ b/resume cv/Varadharajan-International trainer.docx
@@ -404,9 +404,9 @@
         <w:tblLook w:val="0000" w:firstRow="0" w:lastRow="0" w:firstColumn="0" w:lastColumn="0" w:noHBand="0" w:noVBand="0"/>
       </w:tblPr>
       <w:tblGrid>
-        <w:gridCol w:w="2506"/>
-        <w:gridCol w:w="4123"/>
-        <w:gridCol w:w="1276"/>
+        <w:gridCol w:w="2263"/>
+        <w:gridCol w:w="3969"/>
+        <w:gridCol w:w="1673"/>
         <w:gridCol w:w="2118"/>
       </w:tblGrid>
       <w:tr>
@@ -415,7 +415,7 @@
         </w:trPr>
         <w:tc>
           <w:tcPr>
-            <w:tcW w:w="2506" w:type="dxa"/>
+            <w:tcW w:w="2263" w:type="dxa"/>
           </w:tcPr>
           <w:p>
             <w:r>
@@ -429,7 +429,7 @@
         </w:tc>
         <w:tc>
           <w:tcPr>
-            <w:tcW w:w="4123" w:type="dxa"/>
+            <w:tcW w:w="3969" w:type="dxa"/>
           </w:tcPr>
           <w:p>
             <w:r>
@@ -443,7 +443,7 @@
         </w:tc>
         <w:tc>
           <w:tcPr>
-            <w:tcW w:w="1276" w:type="dxa"/>
+            <w:tcW w:w="1673" w:type="dxa"/>
           </w:tcPr>
           <w:p>
             <w:r>
@@ -476,7 +476,7 @@
         </w:trPr>
         <w:tc>
           <w:tcPr>
-            <w:tcW w:w="2506" w:type="dxa"/>
+            <w:tcW w:w="2263" w:type="dxa"/>
           </w:tcPr>
           <w:p>
             <w:pPr>
@@ -488,13 +488,23 @@
             </w:r>
             <w:proofErr w:type="spellEnd"/>
             <w:r>
-              <w:t xml:space="preserve"> Foundation</w:t>
-            </w:r>
-          </w:p>
-        </w:tc>
-        <w:tc>
-          <w:tcPr>
-            <w:tcW w:w="4123" w:type="dxa"/>
+              <w:t xml:space="preserve"> </w:t>
+            </w:r>
+            <w:proofErr w:type="spellStart"/>
+            <w:proofErr w:type="gramStart"/>
+            <w:r>
+              <w:t>Foundation</w:t>
+            </w:r>
+            <w:r>
+              <w:t>,India</w:t>
+            </w:r>
+            <w:proofErr w:type="spellEnd"/>
+            <w:proofErr w:type="gramEnd"/>
+          </w:p>
+        </w:tc>
+        <w:tc>
+          <w:tcPr>
+            <w:tcW w:w="3969" w:type="dxa"/>
           </w:tcPr>
           <w:p>
             <w:pPr>
@@ -507,7 +517,7 @@
         </w:tc>
         <w:tc>
           <w:tcPr>
-            <w:tcW w:w="1276" w:type="dxa"/>
+            <w:tcW w:w="1673" w:type="dxa"/>
           </w:tcPr>
           <w:p>
             <w:pPr>
@@ -551,7 +561,7 @@
         </w:trPr>
         <w:tc>
           <w:tcPr>
-            <w:tcW w:w="2506" w:type="dxa"/>
+            <w:tcW w:w="2263" w:type="dxa"/>
           </w:tcPr>
           <w:p>
             <w:pPr>
@@ -565,11 +575,14 @@
             <w:r>
               <w:t xml:space="preserve"> Operation Program</w:t>
             </w:r>
-          </w:p>
-        </w:tc>
-        <w:tc>
-          <w:tcPr>
-            <w:tcW w:w="4123" w:type="dxa"/>
+            <w:r>
+              <w:t>, India</w:t>
+            </w:r>
+          </w:p>
+        </w:tc>
+        <w:tc>
+          <w:tcPr>
+            <w:tcW w:w="3969" w:type="dxa"/>
           </w:tcPr>
           <w:p>
             <w:pPr>
@@ -593,7 +606,7 @@
         </w:tc>
         <w:tc>
           <w:tcPr>
-            <w:tcW w:w="1276" w:type="dxa"/>
+            <w:tcW w:w="1673" w:type="dxa"/>
           </w:tcPr>
           <w:p>
             <w:pPr>
@@ -631,7 +644,7 @@
         </w:trPr>
         <w:tc>
           <w:tcPr>
-            <w:tcW w:w="2506" w:type="dxa"/>
+            <w:tcW w:w="2263" w:type="dxa"/>
           </w:tcPr>
           <w:p>
             <w:pPr>
@@ -644,7 +657,7 @@
         </w:tc>
         <w:tc>
           <w:tcPr>
-            <w:tcW w:w="4123" w:type="dxa"/>
+            <w:tcW w:w="3969" w:type="dxa"/>
           </w:tcPr>
           <w:p>
             <w:pPr>
@@ -657,7 +670,7 @@
         </w:tc>
         <w:tc>
           <w:tcPr>
-            <w:tcW w:w="1276" w:type="dxa"/>
+            <w:tcW w:w="1673" w:type="dxa"/>
           </w:tcPr>
           <w:p>
             <w:pPr>
@@ -692,7 +705,7 @@
         </w:trPr>
         <w:tc>
           <w:tcPr>
-            <w:tcW w:w="2506" w:type="dxa"/>
+            <w:tcW w:w="2263" w:type="dxa"/>
           </w:tcPr>
           <w:p>
             <w:pPr>
@@ -710,7 +723,7 @@
         </w:tc>
         <w:tc>
           <w:tcPr>
-            <w:tcW w:w="4123" w:type="dxa"/>
+            <w:tcW w:w="3969" w:type="dxa"/>
           </w:tcPr>
           <w:p>
             <w:pPr>
@@ -723,7 +736,7 @@
         </w:tc>
         <w:tc>
           <w:tcPr>
-            <w:tcW w:w="1276" w:type="dxa"/>
+            <w:tcW w:w="1673" w:type="dxa"/>
           </w:tcPr>
           <w:p>
             <w:pPr>
@@ -761,7 +774,7 @@
         </w:trPr>
         <w:tc>
           <w:tcPr>
-            <w:tcW w:w="2506" w:type="dxa"/>
+            <w:tcW w:w="2263" w:type="dxa"/>
           </w:tcPr>
           <w:p>
             <w:pPr>
@@ -774,7 +787,7 @@
         </w:tc>
         <w:tc>
           <w:tcPr>
-            <w:tcW w:w="4123" w:type="dxa"/>
+            <w:tcW w:w="3969" w:type="dxa"/>
           </w:tcPr>
           <w:p>
             <w:pPr>
@@ -787,7 +800,7 @@
         </w:tc>
         <w:tc>
           <w:tcPr>
-            <w:tcW w:w="1276" w:type="dxa"/>
+            <w:tcW w:w="1673" w:type="dxa"/>
           </w:tcPr>
           <w:p>
             <w:pPr>
@@ -822,7 +835,7 @@
         </w:trPr>
         <w:tc>
           <w:tcPr>
-            <w:tcW w:w="2506" w:type="dxa"/>
+            <w:tcW w:w="2263" w:type="dxa"/>
           </w:tcPr>
           <w:p>
             <w:pPr>
@@ -835,7 +848,7 @@
         </w:tc>
         <w:tc>
           <w:tcPr>
-            <w:tcW w:w="4123" w:type="dxa"/>
+            <w:tcW w:w="3969" w:type="dxa"/>
           </w:tcPr>
           <w:p>
             <w:pPr>
@@ -848,7 +861,7 @@
         </w:tc>
         <w:tc>
           <w:tcPr>
-            <w:tcW w:w="1276" w:type="dxa"/>
+            <w:tcW w:w="1673" w:type="dxa"/>
           </w:tcPr>
           <w:p>
             <w:pPr>
@@ -887,7 +900,7 @@
         </w:trPr>
         <w:tc>
           <w:tcPr>
-            <w:tcW w:w="2506" w:type="dxa"/>
+            <w:tcW w:w="2263" w:type="dxa"/>
           </w:tcPr>
           <w:p>
             <w:pPr>
@@ -900,7 +913,7 @@
         </w:tc>
         <w:tc>
           <w:tcPr>
-            <w:tcW w:w="4123" w:type="dxa"/>
+            <w:tcW w:w="3969" w:type="dxa"/>
           </w:tcPr>
           <w:p>
             <w:pPr>
@@ -913,7 +926,7 @@
         </w:tc>
         <w:tc>
           <w:tcPr>
-            <w:tcW w:w="1276" w:type="dxa"/>
+            <w:tcW w:w="1673" w:type="dxa"/>
           </w:tcPr>
           <w:p>
             <w:pPr>
@@ -3848,18 +3861,6 @@
           <w:szCs w:val="24"/>
         </w:rPr>
       </w:pPr>
-    </w:p>
-    <w:p>
-      <w:pPr>
-        <w:spacing w:before="240" w:after="300"/>
-        <w:jc w:val="right"/>
-        <w:rPr>
-          <w:b/>
-          <w:bCs/>
-          <w:sz w:val="24"/>
-          <w:szCs w:val="24"/>
-        </w:rPr>
-      </w:pPr>
       <w:r>
         <w:rPr>
           <w:b/>
@@ -3872,7 +3873,7 @@
     </w:p>
     <w:sectPr>
       <w:pgSz w:w="12240" w:h="15840"/>
-      <w:pgMar w:top="1440" w:right="1440" w:bottom="1135" w:left="1440" w:header="720" w:footer="720" w:gutter="0"/>
+      <w:pgMar w:top="1276" w:right="1440" w:bottom="1135" w:left="1440" w:header="720" w:footer="720" w:gutter="0"/>
       <w:cols w:space="720"/>
       <w:docGrid w:linePitch="360" w:charSpace="4096"/>
     </w:sectPr>

</xml_diff>

<commit_message>
Update portfolio and trainer documents
</commit_message>
<xml_diff>
--- a/resume cv/Varadharajan-International trainer.docx
+++ b/resume cv/Varadharajan-International trainer.docx
@@ -169,7 +169,15 @@
         <w:t>faculties</w:t>
       </w:r>
       <w:r>
-        <w:t xml:space="preserve"> and professionals, in partnership with global organisations including Amazon, Infosys, Siemens, EY, and Capgemini. Seeking to expand cross-border academic and corporate training collaborations across Asia through online and offline engagements in Java, Python, MERN, DevOps, and AI.</w:t>
+        <w:t xml:space="preserve"> and professionals, in partnership with global </w:t>
+      </w:r>
+      <w:proofErr w:type="spellStart"/>
+      <w:r>
+        <w:t>organisations</w:t>
+      </w:r>
+      <w:proofErr w:type="spellEnd"/>
+      <w:r>
+        <w:t xml:space="preserve"> including Amazon, Infosys, Siemens, EY, and Capgemini. Seeking to expand cross-border academic and corporate training collaborations across Asia through online and offline engagements in Java, Python, MERN, DevOps, and AI.</w:t>
       </w:r>
     </w:p>
     <w:p>
@@ -315,9 +323,11 @@
       <w:r>
         <w:t xml:space="preserve"> — Python, Power BI, Machine Learning, Data </w:t>
       </w:r>
+      <w:proofErr w:type="spellStart"/>
       <w:r>
         <w:t>Visualisation</w:t>
       </w:r>
+      <w:proofErr w:type="spellEnd"/>
       <w:r>
         <w:t>, AI Prompt Engineering</w:t>
       </w:r>
@@ -472,12 +482,24 @@
             <w:pPr>
               <w:spacing w:line="200" w:lineRule="exact"/>
             </w:pPr>
-            <w:r>
-              <w:t>Edunet Foundation</w:t>
+            <w:proofErr w:type="spellStart"/>
+            <w:r>
+              <w:t>Edunet</w:t>
+            </w:r>
+            <w:proofErr w:type="spellEnd"/>
+            <w:r>
+              <w:t xml:space="preserve"> </w:t>
+            </w:r>
+            <w:proofErr w:type="spellStart"/>
+            <w:proofErr w:type="gramStart"/>
+            <w:r>
+              <w:t>Foundation</w:t>
             </w:r>
             <w:r>
               <w:t>,India</w:t>
             </w:r>
+            <w:proofErr w:type="spellEnd"/>
+            <w:proofErr w:type="gramEnd"/>
           </w:p>
         </w:tc>
         <w:tc>
@@ -548,8 +570,13 @@
             <w:pPr>
               <w:spacing w:line="200" w:lineRule="exact"/>
             </w:pPr>
-            <w:r>
-              <w:t>Matrixx Operation Program</w:t>
+            <w:proofErr w:type="spellStart"/>
+            <w:r>
+              <w:t>Matrixx</w:t>
+            </w:r>
+            <w:proofErr w:type="spellEnd"/>
+            <w:r>
+              <w:t xml:space="preserve"> Operation Program</w:t>
             </w:r>
             <w:r>
               <w:t>, India</w:t>
@@ -564,8 +591,13 @@
             <w:pPr>
               <w:spacing w:line="200" w:lineRule="exact"/>
             </w:pPr>
-            <w:r>
-              <w:t>Matrixx Foundation, Technical basics, DevOps Integration Module, Monitoring &amp; Observability</w:t>
+            <w:proofErr w:type="spellStart"/>
+            <w:r>
+              <w:t>Matrixx</w:t>
+            </w:r>
+            <w:proofErr w:type="spellEnd"/>
+            <w:r>
+              <w:t xml:space="preserve"> Foundation, Technical basics, DevOps Integration Module, Monitoring &amp; Observability</w:t>
             </w:r>
             <w:r>
               <w:t>,</w:t>
@@ -682,8 +714,13 @@
             <w:pPr>
               <w:spacing w:line="200" w:lineRule="exact"/>
             </w:pPr>
-            <w:r>
-              <w:t>EduBridge Learning India Pvt Ltd, Mumbai</w:t>
+            <w:proofErr w:type="spellStart"/>
+            <w:r>
+              <w:t>EduBridge</w:t>
+            </w:r>
+            <w:proofErr w:type="spellEnd"/>
+            <w:r>
+              <w:t xml:space="preserve"> Learning India Pvt Ltd, Mumbai</w:t>
             </w:r>
           </w:p>
         </w:tc>
@@ -1066,7 +1103,15 @@
         </w:rPr>
       </w:pPr>
       <w:r>
-        <w:t>Foundation for Test Automation using Sahi Pro</w:t>
+        <w:t xml:space="preserve">Foundation for Test Automation using </w:t>
+      </w:r>
+      <w:proofErr w:type="spellStart"/>
+      <w:r>
+        <w:t>Sahi</w:t>
+      </w:r>
+      <w:proofErr w:type="spellEnd"/>
+      <w:r>
+        <w:t xml:space="preserve"> Pro</w:t>
       </w:r>
     </w:p>
     <w:p>
@@ -1106,16 +1151,38 @@
           <w:sz w:val="24"/>
           <w:szCs w:val="24"/>
         </w:rPr>
-        <w:t>Senior Java Developer – Magendhiran Consultancy Services</w:t>
+        <w:t xml:space="preserve">Senior Java Developer – </w:t>
+      </w:r>
+      <w:proofErr w:type="spellStart"/>
+      <w:r>
+        <w:rPr>
+          <w:b/>
+          <w:bCs/>
+          <w:sz w:val="24"/>
+          <w:szCs w:val="24"/>
+        </w:rPr>
+        <w:t>Magendhiran</w:t>
+      </w:r>
+      <w:proofErr w:type="spellEnd"/>
+      <w:r>
+        <w:rPr>
+          <w:b/>
+          <w:bCs/>
+          <w:sz w:val="24"/>
+          <w:szCs w:val="24"/>
+        </w:rPr>
+        <w:t xml:space="preserve"> Consultancy Services</w:t>
       </w:r>
     </w:p>
     <w:p>
       <w:r>
         <w:t xml:space="preserve">Client: Regency </w:t>
       </w:r>
+      <w:proofErr w:type="spellStart"/>
       <w:r>
         <w:t>Centres</w:t>
       </w:r>
+      <w:proofErr w:type="spellEnd"/>
       <w:r>
         <w:t xml:space="preserve"> | Mar 2019 – May 2020</w:t>
       </w:r>
@@ -1147,7 +1214,15 @@
         <w:ind w:left="360"/>
       </w:pPr>
       <w:r>
-        <w:t>•  Used REST APIs, Zipkin, Swagger</w:t>
+        <w:t xml:space="preserve">•  Used REST APIs, </w:t>
+      </w:r>
+      <w:proofErr w:type="spellStart"/>
+      <w:r>
+        <w:t>Zipkin</w:t>
+      </w:r>
+      <w:proofErr w:type="spellEnd"/>
+      <w:r>
+        <w:t>, Swagger</w:t>
       </w:r>
     </w:p>
     <w:p>
@@ -1183,7 +1258,27 @@
           <w:sz w:val="24"/>
           <w:szCs w:val="24"/>
         </w:rPr>
-        <w:t>Java Developer – Magendhiran Consultancy Services</w:t>
+        <w:t xml:space="preserve">Java Developer – </w:t>
+      </w:r>
+      <w:proofErr w:type="spellStart"/>
+      <w:r>
+        <w:rPr>
+          <w:b/>
+          <w:bCs/>
+          <w:sz w:val="24"/>
+          <w:szCs w:val="24"/>
+        </w:rPr>
+        <w:t>Magendhiran</w:t>
+      </w:r>
+      <w:proofErr w:type="spellEnd"/>
+      <w:r>
+        <w:rPr>
+          <w:b/>
+          <w:bCs/>
+          <w:sz w:val="24"/>
+          <w:szCs w:val="24"/>
+        </w:rPr>
+        <w:t xml:space="preserve"> Consultancy Services</w:t>
       </w:r>
     </w:p>
     <w:p>
@@ -1331,6 +1426,7 @@
                 <w:szCs w:val="20"/>
               </w:rPr>
             </w:pPr>
+            <w:proofErr w:type="gramStart"/>
             <w:r>
               <w:rPr>
                 <w:b/>
@@ -1338,8 +1434,18 @@
                 <w:sz w:val="20"/>
                 <w:szCs w:val="20"/>
               </w:rPr>
+              <w:t>S.</w:t>
+            </w:r>
+            <w:r>
+              <w:rPr>
+                <w:b/>
+                <w:bCs/>
+                <w:sz w:val="20"/>
+                <w:szCs w:val="20"/>
+              </w:rPr>
               <w:t>N</w:t>
             </w:r>
+            <w:proofErr w:type="gramEnd"/>
           </w:p>
         </w:tc>
         <w:tc>
@@ -3272,7 +3378,15 @@
         <w:jc w:val="both"/>
       </w:pPr>
       <w:r>
-        <w:t>EITCI Programme Committee Member -ID: EITCI-PCM-48267</w:t>
+        <w:t xml:space="preserve">EITCI </w:t>
+      </w:r>
+      <w:proofErr w:type="spellStart"/>
+      <w:r>
+        <w:t>Programme</w:t>
+      </w:r>
+      <w:proofErr w:type="spellEnd"/>
+      <w:r>
+        <w:t xml:space="preserve"> Committee Member -ID: EITCI-PCM-48267</w:t>
       </w:r>
     </w:p>
     <w:p>
@@ -3447,7 +3561,15 @@
         </w:rPr>
       </w:pPr>
       <w:r>
-        <w:t>Framed syllabi for autonomous colleges and universities (Saveetha University, Sona College of Technology, Jerusalem College of Engineering)</w:t>
+        <w:t>Framed syllabi for autonomous colleges and universities (</w:t>
+      </w:r>
+      <w:proofErr w:type="spellStart"/>
+      <w:r>
+        <w:t>Saveetha</w:t>
+      </w:r>
+      <w:proofErr w:type="spellEnd"/>
+      <w:r>
+        <w:t xml:space="preserve"> University, Sona College of Technology, Jerusalem College of Engineering)</w:t>
       </w:r>
     </w:p>
     <w:p>
@@ -3477,7 +3599,23 @@
         <w:jc w:val="both"/>
       </w:pPr>
       <w:r>
-        <w:t>1. Varadharajan. A, Iyappan. L and P. Kasinatha Pandian, Assessment on land-use changes in Coimbatore North Taluk using Image Processing and Geospatial techniques, International Journal of Engineering Research and Applications (IJERA), ISSN: 2248-9622, Vol. 2, Issue 4, pp. 233-237, July 2012.</w:t>
+        <w:t xml:space="preserve">1. Varadharajan. A, </w:t>
+      </w:r>
+      <w:proofErr w:type="spellStart"/>
+      <w:r>
+        <w:t>Iyappan</w:t>
+      </w:r>
+      <w:proofErr w:type="spellEnd"/>
+      <w:r>
+        <w:t xml:space="preserve">. L and P. </w:t>
+      </w:r>
+      <w:proofErr w:type="spellStart"/>
+      <w:r>
+        <w:t>Kasinatha</w:t>
+      </w:r>
+      <w:proofErr w:type="spellEnd"/>
+      <w:r>
+        <w:t xml:space="preserve"> Pandian, Assessment on land-use changes in Coimbatore North Taluk using Image Processing and Geospatial techniques, International Journal of Engineering Research and Applications (IJERA), ISSN: 2248-9622, Vol. 2, Issue 4, pp. 233-237, July 2012.</w:t>
       </w:r>
     </w:p>
     <w:p>
@@ -3633,8 +3771,13 @@
             <w:tcW w:w="4111" w:type="dxa"/>
           </w:tcPr>
           <w:p>
-            <w:r>
-              <w:t>Azhagappa University, Karaikudi</w:t>
+            <w:proofErr w:type="spellStart"/>
+            <w:r>
+              <w:t>Azhagappa</w:t>
+            </w:r>
+            <w:proofErr w:type="spellEnd"/>
+            <w:r>
+              <w:t xml:space="preserve"> University, Karaikudi</w:t>
             </w:r>
           </w:p>
         </w:tc>
@@ -3683,7 +3826,15 @@
           </w:tcPr>
           <w:p>
             <w:r>
-              <w:t>B.S Abdur Rahman Crescent University, Chennai</w:t>
+              <w:t xml:space="preserve">B.S </w:t>
+            </w:r>
+            <w:proofErr w:type="spellStart"/>
+            <w:r>
+              <w:t>Abdur</w:t>
+            </w:r>
+            <w:proofErr w:type="spellEnd"/>
+            <w:r>
+              <w:t xml:space="preserve"> Rahman Crescent University, Chennai</w:t>
             </w:r>
           </w:p>
         </w:tc>
@@ -3707,6 +3858,8 @@
             <w:tcW w:w="1101" w:type="dxa"/>
           </w:tcPr>
           <w:p>
+            <w:proofErr w:type="spellStart"/>
+            <w:proofErr w:type="gramStart"/>
             <w:r>
               <w:rPr>
                 <w:b/>
@@ -3714,6 +3867,8 @@
               </w:rPr>
               <w:t>B.Tech</w:t>
             </w:r>
+            <w:proofErr w:type="spellEnd"/>
+            <w:proofErr w:type="gramEnd"/>
           </w:p>
         </w:tc>
         <w:tc>
@@ -3731,8 +3886,13 @@
             <w:tcW w:w="4111" w:type="dxa"/>
           </w:tcPr>
           <w:p>
-            <w:r>
-              <w:t>Pallavan College of Engineering, Kanchipuram</w:t>
+            <w:proofErr w:type="spellStart"/>
+            <w:r>
+              <w:t>Pallavan</w:t>
+            </w:r>
+            <w:proofErr w:type="spellEnd"/>
+            <w:r>
+              <w:t xml:space="preserve"> College of Engineering, Kanchipuram</w:t>
             </w:r>
           </w:p>
         </w:tc>
@@ -3780,8 +3940,13 @@
             <w:tcW w:w="4111" w:type="dxa"/>
           </w:tcPr>
           <w:p>
-            <w:r>
-              <w:t>Pallavan Polytechnic, Kanchipuram</w:t>
+            <w:proofErr w:type="spellStart"/>
+            <w:r>
+              <w:t>Pallavan</w:t>
+            </w:r>
+            <w:proofErr w:type="spellEnd"/>
+            <w:r>
+              <w:t xml:space="preserve"> Polytechnic, Kanchipuram</w:t>
             </w:r>
           </w:p>
         </w:tc>

</xml_diff>